<commit_message>
Update assignment document with corrected queries and results
Co-Authored-By: Claude Opus 5.5 <noreply@anthropic.com>
Claude-Session: https://claude.ai/code/session_01P2zuw7v6QsegkKquyYDKka
</commit_message>
<xml_diff>
--- a/Analytics_mindset_case_studies_PCard_assignment.docx
+++ b/Analytics_mindset_case_studies_PCard_assignment.docx
@@ -4995,386 +4995,15 @@
         <w:pStyle w:val="ControlFieldText"/>
       </w:pPr>
       <w:r>
-        <w:t>Display the name and total amount spent during the year for all employees who spent more than $50,000 in 2014. Sort by the total amount spent with the larger amounts listed first.</w:t>
-      </w:r>
-      <w:r>
-        <w:br/>
-      </w:r>
-      <w:r>
-        <w:t>SQLite query</w:t>
-      </w:r>
-    </w:p>
-    <w:p>
-      <w:pPr>
-        <w:pStyle w:val="ControlFieldText"/>
-        <w:rPr>
-          <w:rFonts w:ascii="Consolas" w:hAnsi="Consolas"/>
-        </w:rPr>
-      </w:pPr>
-      <w:r>
-        <w:rPr>
-          <w:rFonts w:ascii="Consolas" w:hAnsi="Consolas"/>
-        </w:rPr>
-        <w:t xml:space="preserve">SELECT </w:t>
-      </w:r>
-      <w:proofErr w:type="spellStart"/>
-      <w:r>
-        <w:rPr>
-          <w:rFonts w:ascii="Consolas" w:hAnsi="Consolas"/>
-        </w:rPr>
-        <w:t>FullName</w:t>
-      </w:r>
-      <w:proofErr w:type="spellEnd"/>
-      <w:r>
-        <w:rPr>
-          <w:rFonts w:ascii="Consolas" w:hAnsi="Consolas"/>
-        </w:rPr>
-        <w:t xml:space="preserve">, SUM(Amount) AS </w:t>
-      </w:r>
-      <w:proofErr w:type="spellStart"/>
-      <w:r>
-        <w:rPr>
-          <w:rFonts w:ascii="Consolas" w:hAnsi="Consolas"/>
-        </w:rPr>
-        <w:t>TotalSpent</w:t>
-      </w:r>
-      <w:proofErr w:type="spellEnd"/>
-      <w:r>
-        <w:rPr>
-          <w:rFonts w:ascii="Consolas" w:hAnsi="Consolas"/>
-        </w:rPr>
-        <w:t xml:space="preserve"> </w:t>
-      </w:r>
-      <w:r>
-        <w:rPr>
-          <w:rFonts w:ascii="Consolas" w:hAnsi="Consolas"/>
-        </w:rPr>
-        <w:t xml:space="preserve">FROM </w:t>
-      </w:r>
-      <w:proofErr w:type="spellStart"/>
-      <w:r>
-        <w:rPr>
-          <w:rFonts w:ascii="Consolas" w:hAnsi="Consolas"/>
-        </w:rPr>
-        <w:t>pcards</w:t>
-      </w:r>
-      <w:proofErr w:type="spellEnd"/>
+        <w:t xml:space="preserve">Display the name and total amount spent during the year for all employees who spent more than $50,000 in 2014. Sort by the total amount spent with the larger amounts listed first.</w:t>
+      </w:r>
     </w:p>
     <w:p>
       <w:pPr>
         <w:pStyle w:val="ControlFieldLabel"/>
-        <w:rPr>
-          <w:rFonts w:ascii="Consolas" w:hAnsi="Consolas"/>
-          <w:b w:val="0"/>
-          <w:color w:val="auto"/>
-        </w:rPr>
-      </w:pPr>
-      <w:r>
-        <w:rPr>
-          <w:rFonts w:ascii="Consolas" w:hAnsi="Consolas"/>
-          <w:b w:val="0"/>
-          <w:color w:val="auto"/>
-        </w:rPr>
-        <w:t>WHERE Year = 2014</w:t>
-      </w:r>
-    </w:p>
-    <w:p>
-      <w:pPr>
-        <w:pStyle w:val="ControlFieldLabel"/>
-        <w:rPr>
-          <w:rFonts w:ascii="Consolas" w:hAnsi="Consolas"/>
-          <w:b w:val="0"/>
-          <w:color w:val="auto"/>
-        </w:rPr>
-      </w:pPr>
-      <w:r>
-        <w:rPr>
-          <w:rFonts w:ascii="Consolas" w:hAnsi="Consolas"/>
-          <w:b w:val="0"/>
-          <w:color w:val="auto"/>
-        </w:rPr>
-        <w:t xml:space="preserve">GROUP BY </w:t>
-      </w:r>
-      <w:proofErr w:type="spellStart"/>
-      <w:r>
-        <w:rPr>
-          <w:rFonts w:ascii="Consolas" w:hAnsi="Consolas"/>
-          <w:b w:val="0"/>
-          <w:color w:val="auto"/>
-        </w:rPr>
-        <w:t>FullName</w:t>
-      </w:r>
-      <w:proofErr w:type="spellEnd"/>
-    </w:p>
-    <w:p>
-      <w:pPr>
-        <w:pStyle w:val="ControlFieldLabel"/>
-        <w:rPr>
-          <w:rFonts w:ascii="Consolas" w:hAnsi="Consolas"/>
-          <w:b w:val="0"/>
-          <w:color w:val="auto"/>
-        </w:rPr>
-      </w:pPr>
-      <w:r>
-        <w:rPr>
-          <w:rFonts w:ascii="Consolas" w:hAnsi="Consolas"/>
-          <w:b w:val="0"/>
-          <w:color w:val="auto"/>
-        </w:rPr>
-        <w:t xml:space="preserve">HAVING </w:t>
-      </w:r>
-      <w:proofErr w:type="spellStart"/>
-      <w:r>
-        <w:rPr>
-          <w:rFonts w:ascii="Consolas" w:hAnsi="Consolas"/>
-          <w:b w:val="0"/>
-          <w:color w:val="auto"/>
-        </w:rPr>
-        <w:t>TotalSpent</w:t>
-      </w:r>
-      <w:proofErr w:type="spellEnd"/>
-      <w:r>
-        <w:rPr>
-          <w:rFonts w:ascii="Consolas" w:hAnsi="Consolas"/>
-          <w:b w:val="0"/>
-          <w:color w:val="auto"/>
-        </w:rPr>
-        <w:t xml:space="preserve"> &gt; 50000</w:t>
-      </w:r>
-    </w:p>
-    <w:p>
-      <w:pPr>
-        <w:pStyle w:val="ControlFieldLabel"/>
-      </w:pPr>
-      <w:r>
-        <w:rPr>
-          <w:rFonts w:ascii="Consolas" w:hAnsi="Consolas"/>
-          <w:b w:val="0"/>
-          <w:color w:val="auto"/>
-        </w:rPr>
-        <w:t xml:space="preserve">ORDER BY </w:t>
-      </w:r>
-      <w:proofErr w:type="spellStart"/>
-      <w:r>
-        <w:rPr>
-          <w:rFonts w:ascii="Consolas" w:hAnsi="Consolas"/>
-          <w:b w:val="0"/>
-          <w:color w:val="auto"/>
-        </w:rPr>
-        <w:t>TotalSpent</w:t>
-      </w:r>
-      <w:proofErr w:type="spellEnd"/>
-      <w:r>
-        <w:rPr>
-          <w:rFonts w:ascii="Consolas" w:hAnsi="Consolas"/>
-          <w:b w:val="0"/>
-          <w:color w:val="auto"/>
-        </w:rPr>
-        <w:t xml:space="preserve"> </w:t>
-      </w:r>
-      <w:proofErr w:type="spellStart"/>
-      <w:proofErr w:type="gramStart"/>
-      <w:r>
-        <w:rPr>
-          <w:rFonts w:ascii="Consolas" w:hAnsi="Consolas"/>
-          <w:b w:val="0"/>
-          <w:color w:val="auto"/>
-        </w:rPr>
-        <w:t>DESC;</w:t>
-      </w:r>
-      <w:r>
-        <w:t>Results</w:t>
-      </w:r>
-      <w:proofErr w:type="spellEnd"/>
-      <w:proofErr w:type="gramEnd"/>
-      <w:r>
-        <w:t xml:space="preserve"> and conclusion</w:t>
-      </w:r>
-    </w:p>
-    <w:p>
-      <w:pPr>
-        <w:pStyle w:val="ControlBlockTitle"/>
-        <w:rPr>
-          <w:i/>
-          <w:color w:val="707A86"/>
-          <w:sz w:val="18"/>
-        </w:rPr>
-      </w:pPr>
-      <w:r>
-        <w:rPr>
-          <w:bCs/>
-          <w:i/>
-          <w:color w:val="707A86"/>
-          <w:sz w:val="18"/>
-        </w:rPr>
-        <w:t>Results and conclusion:</w:t>
-      </w:r>
-      <w:r>
-        <w:rPr>
-          <w:i/>
-          <w:color w:val="707A86"/>
-          <w:sz w:val="18"/>
-        </w:rPr>
-        <w:t xml:space="preserve"> The query identified a total of </w:t>
-      </w:r>
-      <w:r>
-        <w:rPr>
-          <w:bCs/>
-          <w:i/>
-          <w:color w:val="707A86"/>
-          <w:sz w:val="18"/>
-        </w:rPr>
-        <w:t>127 employees</w:t>
-      </w:r>
-      <w:r>
-        <w:rPr>
-          <w:i/>
-          <w:color w:val="707A86"/>
-          <w:sz w:val="18"/>
-        </w:rPr>
-        <w:t xml:space="preserve"> whose cumulative P-card spending exceeded the $50,000 threshold during calendar year 2014. </w:t>
-      </w:r>
-    </w:p>
-    <w:p>
-      <w:pPr>
-        <w:pStyle w:val="ControlBlockTitle"/>
-        <w:numPr>
-          <w:ilvl w:val="0"/>
-          <w:numId w:val="13"/>
-        </w:numPr>
-        <w:rPr>
-          <w:i/>
-          <w:color w:val="707A86"/>
-          <w:sz w:val="18"/>
-        </w:rPr>
-      </w:pPr>
-      <w:r>
-        <w:rPr>
-          <w:bCs/>
-          <w:i/>
-          <w:color w:val="707A86"/>
-          <w:sz w:val="18"/>
-        </w:rPr>
-        <w:t>Top Spender:</w:t>
-      </w:r>
-      <w:r>
-        <w:rPr>
-          <w:i/>
-          <w:color w:val="707A86"/>
-          <w:sz w:val="18"/>
-        </w:rPr>
-        <w:t xml:space="preserve"> Employee 51914657 ($1,595,302.32)</w:t>
-      </w:r>
-    </w:p>
-    <w:p>
-      <w:pPr>
-        <w:pStyle w:val="ControlBlockTitle"/>
-        <w:numPr>
-          <w:ilvl w:val="0"/>
-          <w:numId w:val="13"/>
-        </w:numPr>
-        <w:rPr>
-          <w:i/>
-          <w:color w:val="707A86"/>
-          <w:sz w:val="18"/>
-        </w:rPr>
-      </w:pPr>
-      <w:r>
-        <w:rPr>
-          <w:bCs/>
-          <w:i/>
-          <w:color w:val="707A86"/>
-          <w:sz w:val="18"/>
-        </w:rPr>
-        <w:t>Second Top Spender:</w:t>
-      </w:r>
-      <w:r>
-        <w:rPr>
-          <w:i/>
-          <w:color w:val="707A86"/>
-          <w:sz w:val="18"/>
-        </w:rPr>
-        <w:t xml:space="preserve"> Employee B1F82F0D ($1,182,054.86)</w:t>
-      </w:r>
-    </w:p>
-    <w:p>
-      <w:pPr>
-        <w:pStyle w:val="ControlBlockTitle"/>
-        <w:numPr>
-          <w:ilvl w:val="0"/>
-          <w:numId w:val="13"/>
-        </w:numPr>
-        <w:rPr>
-          <w:i/>
-          <w:color w:val="707A86"/>
-          <w:sz w:val="18"/>
-        </w:rPr>
-      </w:pPr>
-      <w:r>
-        <w:rPr>
-          <w:bCs/>
-          <w:i/>
-          <w:color w:val="707A86"/>
-          <w:sz w:val="18"/>
-        </w:rPr>
-        <w:t>Third Top Spender:</w:t>
-      </w:r>
-      <w:r>
-        <w:rPr>
-          <w:i/>
-          <w:color w:val="707A86"/>
-          <w:sz w:val="18"/>
-        </w:rPr>
-        <w:t xml:space="preserve"> Employee 699E3D92 ($627,609.56)</w:t>
-      </w:r>
-    </w:p>
-    <w:p>
-      <w:pPr>
-        <w:pStyle w:val="ControlBlockTitle"/>
-      </w:pPr>
-      <w:r>
-        <w:t xml:space="preserve">Control </w:t>
-      </w:r>
-      <w:proofErr w:type="gramStart"/>
-      <w:r>
-        <w:t>2  |</w:t>
-      </w:r>
-      <w:proofErr w:type="gramEnd"/>
-      <w:r>
-        <w:t xml:space="preserve">  User shall not spend more than $10,000 per month without approval.</w:t>
-      </w:r>
-    </w:p>
-    <w:p>
-      <w:pPr>
-        <w:pStyle w:val="ControlFieldLabel"/>
-      </w:pPr>
-      <w:r>
-        <w:t>Test to perform and desired output</w:t>
-      </w:r>
-    </w:p>
-    <w:p>
-      <w:pPr>
-        <w:pStyle w:val="ControlFieldText"/>
-      </w:pPr>
-      <w:r>
-        <w:t xml:space="preserve">Display the name, total amount spent during the month and the month for all employees who spent more than $10,000 per month in 2014. </w:t>
-      </w:r>
-      <w:proofErr w:type="gramStart"/>
-      <w:r>
-        <w:t>Sort</w:t>
-      </w:r>
-      <w:proofErr w:type="gramEnd"/>
-      <w:r>
-        <w:t xml:space="preserve"> by month (January listed first) and then total the amount spent with the larger amounts listed first.</w:t>
-      </w:r>
-    </w:p>
-    <w:p>
-      <w:pPr>
-        <w:pStyle w:val="ControlFieldLabel"/>
-      </w:pPr>
-      <w:r>
-        <w:lastRenderedPageBreak/>
-        <w:t>SQLite query</w:t>
+      </w:pPr>
+      <w:r>
+        <w:t xml:space="preserve">SQLite query</w:t>
       </w:r>
     </w:p>
     <w:p>
@@ -5391,21 +5020,8 @@
         <w:ind w:left="115" w:right="115"/>
       </w:pPr>
       <w:r>
-        <w:t xml:space="preserve">SELECT </w:t>
-      </w:r>
-      <w:proofErr w:type="spellStart"/>
-      <w:r>
-        <w:t>FullName</w:t>
-      </w:r>
-      <w:proofErr w:type="spellEnd"/>
-      <w:r>
-        <w:t xml:space="preserve">, Month, SUM(Amount) AS </w:t>
-      </w:r>
-      <w:proofErr w:type="spellStart"/>
-      <w:r>
-        <w:t>TotalSpent</w:t>
-      </w:r>
-      <w:proofErr w:type="spellEnd"/>
+        <w:t xml:space="preserve">SELECT FullName, SUM(Amount) AS TotalSpent</w:t>
+      </w:r>
     </w:p>
     <w:p>
       <w:pPr>
@@ -5421,13 +5037,8 @@
         <w:ind w:left="115" w:right="115"/>
       </w:pPr>
       <w:r>
-        <w:t xml:space="preserve">FROM </w:t>
-      </w:r>
-      <w:proofErr w:type="spellStart"/>
-      <w:r>
-        <w:t>pcards</w:t>
-      </w:r>
-      <w:proofErr w:type="spellEnd"/>
+        <w:t xml:space="preserve">FROM pcards</w:t>
+      </w:r>
     </w:p>
     <w:p>
       <w:pPr>
@@ -5443,7 +5054,7 @@
         <w:ind w:left="115" w:right="115"/>
       </w:pPr>
       <w:r>
-        <w:t>WHERE Year = 2014</w:t>
+        <w:t xml:space="preserve">WHERE Year = 2014</w:t>
       </w:r>
     </w:p>
     <w:p>
@@ -5460,15 +5071,7 @@
         <w:ind w:left="115" w:right="115"/>
       </w:pPr>
       <w:r>
-        <w:t xml:space="preserve">GROUP BY </w:t>
-      </w:r>
-      <w:proofErr w:type="spellStart"/>
-      <w:r>
-        <w:t>FullName</w:t>
-      </w:r>
-      <w:proofErr w:type="spellEnd"/>
-      <w:r>
-        <w:t>, Month</w:t>
+        <w:t xml:space="preserve">GROUP BY FullName</w:t>
       </w:r>
     </w:p>
     <w:p>
@@ -5485,15 +5088,7 @@
         <w:ind w:left="115" w:right="115"/>
       </w:pPr>
       <w:r>
-        <w:t xml:space="preserve">HAVING </w:t>
-      </w:r>
-      <w:proofErr w:type="spellStart"/>
-      <w:r>
-        <w:t>TotalSpent</w:t>
-      </w:r>
-      <w:proofErr w:type="spellEnd"/>
-      <w:r>
-        <w:t xml:space="preserve"> &gt; 10000</w:t>
+        <w:t xml:space="preserve">HAVING TotalSpent &gt; 50000</w:t>
       </w:r>
     </w:p>
     <w:p>
@@ -5510,15 +5105,7 @@
         <w:ind w:left="115" w:right="115"/>
       </w:pPr>
       <w:r>
-        <w:t xml:space="preserve">ORDER BY Month ASC, </w:t>
-      </w:r>
-      <w:proofErr w:type="spellStart"/>
-      <w:r>
-        <w:t>TotalSpent</w:t>
-      </w:r>
-      <w:proofErr w:type="spellEnd"/>
-      <w:r>
-        <w:t xml:space="preserve"> DESC;</w:t>
+        <w:t xml:space="preserve">ORDER BY TotalSpent DESC;</w:t>
       </w:r>
     </w:p>
     <w:p>
@@ -5526,7 +5113,7 @@
         <w:pStyle w:val="ControlFieldLabel"/>
       </w:pPr>
       <w:r>
-        <w:t>Results and conclusion</w:t>
+        <w:t xml:space="preserve">Results and conclusion</w:t>
       </w:r>
     </w:p>
     <w:p>
@@ -5542,32 +5129,332 @@
         <w:ind w:left="115" w:right="115"/>
       </w:pPr>
       <w:r>
+        <w:rPr/>
+        <w:t xml:space="preserve">The query identified </w:t>
+      </w:r>
+      <w:r>
         <w:rPr>
           <w:b/>
           <w:bCs/>
         </w:rPr>
-        <w:t>Results and conclusion:</w:t>
-      </w:r>
-      <w:r>
-        <w:t xml:space="preserve"> The query </w:t>
-      </w:r>
-      <w:proofErr w:type="gramStart"/>
-      <w:r>
-        <w:t>returned</w:t>
-      </w:r>
-      <w:proofErr w:type="gramEnd"/>
-      <w:r>
-        <w:t xml:space="preserve"> </w:t>
-      </w:r>
+        <w:t xml:space="preserve">127 employees</w:t>
+      </w:r>
+      <w:r>
+        <w:rPr/>
+        <w:t xml:space="preserve"> whose cumulative P-card spending exceeded the $50,000 threshold during calendar year 2014.</w:t>
+      </w:r>
+    </w:p>
+    <w:p>
+      <w:pPr>
+        <w:pStyle w:val="ResultPlaceholder"/>
+        <w:numPr>
+          <w:ilvl w:val="0"/>
+          <w:numId w:val="15"/>
+        </w:numPr>
+        <w:pBdr>
+          <w:top w:val="single" w:sz="4" w:space="4" w:color="C9D1D9"/>
+          <w:left w:val="single" w:sz="4" w:space="4" w:color="C9D1D9"/>
+          <w:bottom w:val="single" w:sz="4" w:space="4" w:color="C9D1D9"/>
+          <w:right w:val="single" w:sz="4" w:space="4" w:color="C9D1D9"/>
+        </w:pBdr>
+        <w:shd w:val="clear" w:color="auto" w:fill="FFFFFF"/>
+        <w:ind w:right="115"/>
+      </w:pPr>
       <w:r>
         <w:rPr>
           <w:b/>
           <w:bCs/>
         </w:rPr>
-        <w:t>457 monthly instances</w:t>
-      </w:r>
-      <w:r>
-        <w:t xml:space="preserve"> where an employee exceeded $10,000 in spending during a single month in calendar year 2014. </w:t>
+        <w:t xml:space="preserve">Top Spender:</w:t>
+      </w:r>
+      <w:r>
+        <w:rPr/>
+        <w:t xml:space="preserve"> Employee 51914657 ($1,595,302.32)</w:t>
+      </w:r>
+    </w:p>
+    <w:p>
+      <w:pPr>
+        <w:pStyle w:val="ResultPlaceholder"/>
+        <w:numPr>
+          <w:ilvl w:val="0"/>
+          <w:numId w:val="15"/>
+        </w:numPr>
+        <w:pBdr>
+          <w:top w:val="single" w:sz="4" w:space="4" w:color="C9D1D9"/>
+          <w:left w:val="single" w:sz="4" w:space="4" w:color="C9D1D9"/>
+          <w:bottom w:val="single" w:sz="4" w:space="4" w:color="C9D1D9"/>
+          <w:right w:val="single" w:sz="4" w:space="4" w:color="C9D1D9"/>
+        </w:pBdr>
+        <w:shd w:val="clear" w:color="auto" w:fill="FFFFFF"/>
+        <w:ind w:right="115"/>
+      </w:pPr>
+      <w:r>
+        <w:rPr>
+          <w:b/>
+          <w:bCs/>
+        </w:rPr>
+        <w:t xml:space="preserve">Second Top Spender:</w:t>
+      </w:r>
+      <w:r>
+        <w:rPr/>
+        <w:t xml:space="preserve"> Employee B1FA2F0D ($1,182,094.86)</w:t>
+      </w:r>
+    </w:p>
+    <w:p>
+      <w:pPr>
+        <w:pStyle w:val="ResultPlaceholder"/>
+        <w:numPr>
+          <w:ilvl w:val="0"/>
+          <w:numId w:val="15"/>
+        </w:numPr>
+        <w:pBdr>
+          <w:top w:val="single" w:sz="4" w:space="4" w:color="C9D1D9"/>
+          <w:left w:val="single" w:sz="4" w:space="4" w:color="C9D1D9"/>
+          <w:bottom w:val="single" w:sz="4" w:space="4" w:color="C9D1D9"/>
+          <w:right w:val="single" w:sz="4" w:space="4" w:color="C9D1D9"/>
+        </w:pBdr>
+        <w:shd w:val="clear" w:color="auto" w:fill="FFFFFF"/>
+        <w:ind w:right="115"/>
+      </w:pPr>
+      <w:r>
+        <w:rPr>
+          <w:b/>
+          <w:bCs/>
+        </w:rPr>
+        <w:t xml:space="preserve">Third Top Spender:</w:t>
+      </w:r>
+      <w:r>
+        <w:rPr/>
+        <w:t xml:space="preserve"> Employee 688E3D92 ($627,608.56)</w:t>
+      </w:r>
+    </w:p>
+    <w:p>
+      <w:pPr>
+        <w:pStyle w:val="ControlBlockTitle"/>
+      </w:pPr>
+      <w:r>
+        <w:t xml:space="preserve">Control </w:t>
+      </w:r>
+      <w:proofErr w:type="gramStart"/>
+      <w:r>
+        <w:t>2  |</w:t>
+      </w:r>
+      <w:proofErr w:type="gramEnd"/>
+      <w:r>
+        <w:t xml:space="preserve">  User shall not spend more than $10,000 per month without approval.</w:t>
+      </w:r>
+    </w:p>
+    <w:p>
+      <w:pPr>
+        <w:pStyle w:val="ControlFieldLabel"/>
+      </w:pPr>
+      <w:r>
+        <w:t>Test to perform and desired output</w:t>
+      </w:r>
+    </w:p>
+    <w:p>
+      <w:pPr>
+        <w:pStyle w:val="ControlFieldText"/>
+      </w:pPr>
+      <w:r>
+        <w:t xml:space="preserve">Display the name, total amount spent during the month and the month for all employees who spent more than $10,000 per month in 2014. </w:t>
+      </w:r>
+      <w:proofErr w:type="gramStart"/>
+      <w:r>
+        <w:t>Sort</w:t>
+      </w:r>
+      <w:proofErr w:type="gramEnd"/>
+      <w:r>
+        <w:t xml:space="preserve"> by month (January listed first) and then total the amount spent with the larger amounts listed first.</w:t>
+      </w:r>
+    </w:p>
+    <w:p>
+      <w:pPr>
+        <w:pStyle w:val="ControlFieldLabel"/>
+      </w:pPr>
+      <w:r>
+        <w:lastRenderedPageBreak/>
+        <w:t>SQLite query</w:t>
+      </w:r>
+    </w:p>
+    <w:p>
+      <w:pPr>
+        <w:pStyle w:val="SQLQueryBlock"/>
+        <w:pBdr>
+          <w:top w:val="single" w:sz="4" w:space="4" w:color="B7C1CC"/>
+          <w:left w:val="single" w:sz="4" w:space="4" w:color="B7C1CC"/>
+          <w:bottom w:val="single" w:sz="4" w:space="4" w:color="B7C1CC"/>
+          <w:right w:val="single" w:sz="4" w:space="4" w:color="B7C1CC"/>
+        </w:pBdr>
+        <w:shd w:val="clear" w:color="auto" w:fill="F3F5F7"/>
+        <w:spacing w:before="40" w:after="120"/>
+        <w:ind w:left="115" w:right="115"/>
+      </w:pPr>
+      <w:r>
+        <w:t xml:space="preserve">SELECT </w:t>
+      </w:r>
+      <w:proofErr w:type="spellStart"/>
+      <w:r>
+        <w:t>FullName</w:t>
+      </w:r>
+      <w:proofErr w:type="spellEnd"/>
+      <w:r>
+        <w:t xml:space="preserve">, Month, SUM(Amount) AS </w:t>
+      </w:r>
+      <w:proofErr w:type="spellStart"/>
+      <w:r>
+        <w:t>TotalSpent</w:t>
+      </w:r>
+      <w:proofErr w:type="spellEnd"/>
+    </w:p>
+    <w:p>
+      <w:pPr>
+        <w:pStyle w:val="SQLQueryBlock"/>
+        <w:pBdr>
+          <w:top w:val="single" w:sz="4" w:space="4" w:color="B7C1CC"/>
+          <w:left w:val="single" w:sz="4" w:space="4" w:color="B7C1CC"/>
+          <w:bottom w:val="single" w:sz="4" w:space="4" w:color="B7C1CC"/>
+          <w:right w:val="single" w:sz="4" w:space="4" w:color="B7C1CC"/>
+        </w:pBdr>
+        <w:shd w:val="clear" w:color="auto" w:fill="F3F5F7"/>
+        <w:spacing w:before="40" w:after="120"/>
+        <w:ind w:left="115" w:right="115"/>
+      </w:pPr>
+      <w:r>
+        <w:t xml:space="preserve">FROM </w:t>
+      </w:r>
+      <w:proofErr w:type="spellStart"/>
+      <w:r>
+        <w:t>pcards</w:t>
+      </w:r>
+      <w:proofErr w:type="spellEnd"/>
+    </w:p>
+    <w:p>
+      <w:pPr>
+        <w:pStyle w:val="SQLQueryBlock"/>
+        <w:pBdr>
+          <w:top w:val="single" w:sz="4" w:space="4" w:color="B7C1CC"/>
+          <w:left w:val="single" w:sz="4" w:space="4" w:color="B7C1CC"/>
+          <w:bottom w:val="single" w:sz="4" w:space="4" w:color="B7C1CC"/>
+          <w:right w:val="single" w:sz="4" w:space="4" w:color="B7C1CC"/>
+        </w:pBdr>
+        <w:shd w:val="clear" w:color="auto" w:fill="F3F5F7"/>
+        <w:spacing w:before="40" w:after="120"/>
+        <w:ind w:left="115" w:right="115"/>
+      </w:pPr>
+      <w:r>
+        <w:t>WHERE Year = 2014</w:t>
+      </w:r>
+    </w:p>
+    <w:p>
+      <w:pPr>
+        <w:pStyle w:val="SQLQueryBlock"/>
+        <w:pBdr>
+          <w:top w:val="single" w:sz="4" w:space="4" w:color="B7C1CC"/>
+          <w:left w:val="single" w:sz="4" w:space="4" w:color="B7C1CC"/>
+          <w:bottom w:val="single" w:sz="4" w:space="4" w:color="B7C1CC"/>
+          <w:right w:val="single" w:sz="4" w:space="4" w:color="B7C1CC"/>
+        </w:pBdr>
+        <w:shd w:val="clear" w:color="auto" w:fill="F3F5F7"/>
+        <w:spacing w:before="40" w:after="120"/>
+        <w:ind w:left="115" w:right="115"/>
+      </w:pPr>
+      <w:r>
+        <w:t xml:space="preserve">GROUP BY </w:t>
+      </w:r>
+      <w:proofErr w:type="spellStart"/>
+      <w:r>
+        <w:t>FullName</w:t>
+      </w:r>
+      <w:proofErr w:type="spellEnd"/>
+      <w:r>
+        <w:t>, Month</w:t>
+      </w:r>
+    </w:p>
+    <w:p>
+      <w:pPr>
+        <w:pStyle w:val="SQLQueryBlock"/>
+        <w:pBdr>
+          <w:top w:val="single" w:sz="4" w:space="4" w:color="B7C1CC"/>
+          <w:left w:val="single" w:sz="4" w:space="4" w:color="B7C1CC"/>
+          <w:bottom w:val="single" w:sz="4" w:space="4" w:color="B7C1CC"/>
+          <w:right w:val="single" w:sz="4" w:space="4" w:color="B7C1CC"/>
+        </w:pBdr>
+        <w:shd w:val="clear" w:color="auto" w:fill="F3F5F7"/>
+        <w:spacing w:before="40" w:after="120"/>
+        <w:ind w:left="115" w:right="115"/>
+      </w:pPr>
+      <w:r>
+        <w:t xml:space="preserve">HAVING </w:t>
+      </w:r>
+      <w:proofErr w:type="spellStart"/>
+      <w:r>
+        <w:t>TotalSpent</w:t>
+      </w:r>
+      <w:proofErr w:type="spellEnd"/>
+      <w:r>
+        <w:t xml:space="preserve"> &gt; 10000</w:t>
+      </w:r>
+    </w:p>
+    <w:p>
+      <w:pPr>
+        <w:pStyle w:val="SQLQueryBlock"/>
+        <w:pBdr>
+          <w:top w:val="single" w:sz="4" w:space="4" w:color="B7C1CC"/>
+          <w:left w:val="single" w:sz="4" w:space="4" w:color="B7C1CC"/>
+          <w:bottom w:val="single" w:sz="4" w:space="4" w:color="B7C1CC"/>
+          <w:right w:val="single" w:sz="4" w:space="4" w:color="B7C1CC"/>
+        </w:pBdr>
+        <w:shd w:val="clear" w:color="auto" w:fill="F3F5F7"/>
+        <w:spacing w:before="40" w:after="120"/>
+        <w:ind w:left="115" w:right="115"/>
+      </w:pPr>
+      <w:r>
+        <w:t xml:space="preserve">ORDER BY Month ASC, </w:t>
+      </w:r>
+      <w:proofErr w:type="spellStart"/>
+      <w:r>
+        <w:t>TotalSpent</w:t>
+      </w:r>
+      <w:proofErr w:type="spellEnd"/>
+      <w:r>
+        <w:t xml:space="preserve"> DESC;</w:t>
+      </w:r>
+    </w:p>
+    <w:p>
+      <w:pPr>
+        <w:pStyle w:val="ControlFieldLabel"/>
+      </w:pPr>
+      <w:r>
+        <w:t>Results and conclusion</w:t>
+      </w:r>
+    </w:p>
+    <w:p>
+      <w:pPr>
+        <w:pStyle w:val="ResultPlaceholder"/>
+        <w:pBdr>
+          <w:top w:val="single" w:sz="4" w:space="4" w:color="C9D1D9"/>
+          <w:left w:val="single" w:sz="4" w:space="4" w:color="C9D1D9"/>
+          <w:bottom w:val="single" w:sz="4" w:space="4" w:color="C9D1D9"/>
+          <w:right w:val="single" w:sz="4" w:space="4" w:color="C9D1D9"/>
+        </w:pBdr>
+        <w:shd w:val="clear" w:color="auto" w:fill="FFFFFF"/>
+        <w:ind w:left="115" w:right="115"/>
+      </w:pPr>
+      <w:r>
+        <w:rPr/>
+        <w:t xml:space="preserve">The query returned </w:t>
+      </w:r>
+      <w:r>
+        <w:rPr>
+          <w:b/>
+          <w:bCs/>
+        </w:rPr>
+        <w:t xml:space="preserve">457 monthly instances</w:t>
+      </w:r>
+      <w:r>
+        <w:rPr/>
+        <w:t xml:space="preserve"> (161 different employees) where an employee exceeded $10,000 in spending during a single month in calendar year 2014.</w:t>
       </w:r>
     </w:p>
     <w:p>
@@ -5591,9 +5478,10 @@
           <w:b/>
           <w:bCs/>
         </w:rPr>
-        <w:t>Top Monthly Spender in Month 1 (January):</w:t>
-      </w:r>
-      <w:r>
+        <w:t xml:space="preserve">Top Monthly Spender in Month 1 (January):</w:t>
+      </w:r>
+      <w:r>
+        <w:rPr/>
         <w:t xml:space="preserve"> Employee 51914657 ($149,700.14)</w:t>
       </w:r>
     </w:p>
@@ -5618,10 +5506,11 @@
           <w:b/>
           <w:bCs/>
         </w:rPr>
-        <w:t>Second Top Monthly Spender in Month 1 (January):</w:t>
-      </w:r>
-      <w:r>
-        <w:t xml:space="preserve"> Employee B1F82F0D ($113,598.39)</w:t>
+        <w:t xml:space="preserve">Second Top Monthly Spender in Month 1 (January):</w:t>
+      </w:r>
+      <w:r>
+        <w:rPr/>
+        <w:t xml:space="preserve"> Employee B1FA2F0D ($112,598.39)</w:t>
       </w:r>
     </w:p>
     <w:p>
@@ -5645,10 +5534,11 @@
           <w:b/>
           <w:bCs/>
         </w:rPr>
-        <w:t>Third Top Monthly Spender in Month 1 (January):</w:t>
-      </w:r>
-      <w:r>
-        <w:t xml:space="preserve"> Employee 699E3D92 ($110,190.50)</w:t>
+        <w:t xml:space="preserve">Third Top Monthly Spender in Month 1 (January):</w:t>
+      </w:r>
+      <w:r>
+        <w:rPr/>
+        <w:t xml:space="preserve"> Employee 688E3D92 ($110,190.56)</w:t>
       </w:r>
     </w:p>
     <w:p>
@@ -5913,10 +5803,11 @@
           <w:b/>
           <w:bCs/>
         </w:rPr>
-        <w:t>Third Largest Transaction:</w:t>
-      </w:r>
-      <w:r>
-        <w:t xml:space="preserve"> Employee 0E3DD9FC spent $22,764.04 at HAMPTON INN &amp; SUITES CRN for ROOM CHARGES on 5/23/2014. </w:t>
+        <w:t xml:space="preserve">Third Largest Transaction:</w:t>
+      </w:r>
+      <w:r>
+        <w:rPr/>
+        <w:t xml:space="preserve"> Employee 0E3DD9FC spent $22,764.84 at HAMPTON INN &amp; SUITES CRN for ROOM CHARGES on 5/23/2014.</w:t>
       </w:r>
     </w:p>
     <w:p>
@@ -6438,10 +6329,11 @@
           <w:b/>
           <w:bCs/>
         </w:rPr>
-        <w:t>Example 1:</w:t>
-      </w:r>
-      <w:r>
-        <w:t xml:space="preserve"> Employee 51914657 made three separate transactions at OKLAHOMA CONTRACTOR ($3,334.00, $860.00, and $936.00) on the same day, exceeding $5,000 in total daily spend. </w:t>
+        <w:t xml:space="preserve">Example 1:</w:t>
+      </w:r>
+      <w:r>
+        <w:rPr/>
+        <w:t xml:space="preserve"> Employee 51914657 made three separate transactions at OKLAHOMA CONTRACTORS SUP ($3,334.00, $860.00 and $936.00) on 1/16/2014, $5,130.00 in total.</w:t>
       </w:r>
     </w:p>
     <w:p>
@@ -6465,10 +6357,11 @@
           <w:b/>
           <w:bCs/>
         </w:rPr>
-        <w:t>Example 2:</w:t>
-      </w:r>
-      <w:r>
-        <w:t xml:space="preserve"> Employee 699E3D92 split transactions at ANIXTER 115687 ($3,143.50 and $2,631.60) for Electrical Parts EA on the same day. </w:t>
+        <w:t xml:space="preserve">Example 2:</w:t>
+      </w:r>
+      <w:r>
+        <w:rPr/>
+        <w:t xml:space="preserve"> Employee 688E3D92 made two transactions at ANIXTER-115687 ($3,143.50 and $2,631.60) for Electrical Parts EA on 1/23/2014, $5,775.10 in total.</w:t>
       </w:r>
     </w:p>
     <w:p>
@@ -6936,10 +6829,11 @@
           <w:b/>
           <w:bCs/>
         </w:rPr>
-        <w:t>Example 1:</w:t>
-      </w:r>
-      <w:r>
-        <w:t xml:space="preserve"> Employee A35AA276 ($3,155.00) and Employee 58A802EC ($3,740.00) both made purchases at AFLV on the same day for GENERAL PURCHASE. </w:t>
+        <w:t xml:space="preserve">Example 1:</w:t>
+      </w:r>
+      <w:r>
+        <w:rPr/>
+        <w:t xml:space="preserve"> Employee A35AA276 ($3,195.00) and Employee 58A802EC ($3,740.00) both made purchases at AFLV on 1/10/2014 for GENERAL PURCHASE.</w:t>
       </w:r>
     </w:p>
     <w:p>
@@ -6963,10 +6857,11 @@
           <w:b/>
           <w:bCs/>
         </w:rPr>
-        <w:t>Example 2:</w:t>
-      </w:r>
-      <w:r>
-        <w:t xml:space="preserve"> Employee C98F592C ($4,306.56) and Employee 223D3DE1 ($385.02, $770.04, and $2,262.00) made purchases at DMI DELL HIGHER EDU on the same day. </w:t>
+        <w:t xml:space="preserve">Example 2:</w:t>
+      </w:r>
+      <w:r>
+        <w:rPr/>
+        <w:t xml:space="preserve"> Employee C98F592C ($4,386.56) and Employee 223D3DE1 ($385.02, $770.04 and $2,262.00) made purchases at DMI DELL HIGHER EDUC on 1/23/2014.</w:t>
       </w:r>
     </w:p>
     <w:p>
@@ -7407,6 +7302,7 @@
         <w:ind w:left="115" w:right="115"/>
       </w:pPr>
       <w:r>
+        <w:rPr/>
         <w:t xml:space="preserve">The query returned </w:t>
       </w:r>
       <w:r>
@@ -7414,10 +7310,11 @@
           <w:b/>
           <w:bCs/>
         </w:rPr>
-        <w:t>180 rows</w:t>
-      </w:r>
-      <w:r>
-        <w:t xml:space="preserve"> representing transactions where the same cardholder made purchases at two different vendors on the same day with a combined daily total exceeding $5,000. </w:t>
+        <w:t xml:space="preserve">160 rows</w:t>
+      </w:r>
+      <w:r>
+        <w:rPr/>
+        <w:t xml:space="preserve"> representing transactions where the same cardholder made purchases at two different vendors on the same day with a combined daily total exceeding $5,000.</w:t>
       </w:r>
     </w:p>
     <w:p>
@@ -7441,11 +7338,11 @@
           <w:b/>
           <w:bCs/>
         </w:rPr>
-        <w:lastRenderedPageBreak/>
-        <w:t>Example 1:</w:t>
-      </w:r>
-      <w:r>
-        <w:t xml:space="preserve"> Employee D8983D50 made purchases at SQ DON-CO PLUMBING ($3,775.00) and ACADEMY OF NUTRI ($5,000.00) on the same day. </w:t>
+        <w:t xml:space="preserve">Example 1:</w:t>
+      </w:r>
+      <w:r>
+        <w:rPr/>
+        <w:t xml:space="preserve"> Employee D8983D5C made purchases at SQ DON-CO PLUMBING ($3,775.00) and ACADEMY OF NUTRI &amp; DIET ($5,000.00) on 1/16/2014.</w:t>
       </w:r>
     </w:p>
     <w:p>
@@ -7469,10 +7366,11 @@
           <w:b/>
           <w:bCs/>
         </w:rPr>
-        <w:t>Example 2:</w:t>
-      </w:r>
-      <w:r>
-        <w:t xml:space="preserve"> Employee 8E374083 made purchases at MIKE'S MEDICAL ($1,741.05 and $1,949.90) and ALL AMERICAN MEDICA ($250.77) on the same day. </w:t>
+        <w:t xml:space="preserve">Example 2:</w:t>
+      </w:r>
+      <w:r>
+        <w:rPr/>
+        <w:t xml:space="preserve"> Employee 8E374083 made purchases at MIKE'S MEDICAL ($1,741.05, $1,948.90 and $1,120.00) and ALL AMERICAN MEDICAL ($250.77) on 1/23/2014.</w:t>
       </w:r>
     </w:p>
     <w:p>
@@ -7933,6 +7831,7 @@
         <w:ind w:left="115" w:right="115"/>
       </w:pPr>
       <w:r>
+        <w:rPr/>
         <w:t xml:space="preserve">The query returned </w:t>
       </w:r>
       <w:r>
@@ -7940,10 +7839,11 @@
           <w:b/>
           <w:bCs/>
         </w:rPr>
-        <w:t>101 rows</w:t>
-      </w:r>
-      <w:r>
-        <w:t xml:space="preserve"> representing travel food transactions incurred by employees on the exact same day they had hotel/lodging charges. </w:t>
+        <w:t xml:space="preserve">101 rows</w:t>
+      </w:r>
+      <w:r>
+        <w:rPr/>
+        <w:t xml:space="preserve"> (32 employees, $19,884.90) representing food transactions incurred by employees on the same day they had hotel/lodging charges.</w:t>
       </w:r>
     </w:p>
     <w:p>
@@ -7967,10 +7867,11 @@
           <w:b/>
           <w:bCs/>
         </w:rPr>
-        <w:t>Example 1:</w:t>
-      </w:r>
-      <w:r>
-        <w:t xml:space="preserve"> Employee 131EBD76 spent $112.62 at MI COCINA on 10/10/2014. </w:t>
+        <w:t xml:space="preserve">Example 1:</w:t>
+      </w:r>
+      <w:r>
+        <w:rPr/>
+        <w:t xml:space="preserve"> Employee 131EED76 spent $112.62 at MI COCINA on 10/10/2014.</w:t>
       </w:r>
     </w:p>
     <w:p>
@@ -7994,10 +7895,11 @@
           <w:b/>
           <w:bCs/>
         </w:rPr>
-        <w:t>Example 2:</w:t>
-      </w:r>
-      <w:r>
-        <w:t xml:space="preserve"> Employee 143A2323 had multiple food purchases on 3/8/2014, including CHICK-FIL-A ($6.67), JIMMY JOHNS ($15.00), MCALISTER'S DELI ($35.00), and another JIMMY JOHNS purchase ($110.00). </w:t>
+        <w:t xml:space="preserve">Example 2:</w:t>
+      </w:r>
+      <w:r>
+        <w:rPr/>
+        <w:t xml:space="preserve"> Employee 143A2323 had multiple food purchases on 3/8/2014, including CHICK-FIL-A ($6.67), JIMMY JOHNS ($15.00), MCALISTER'S DELI ($35.00) and another JIMMY JOHNS purchase ($110.80).</w:t>
       </w:r>
     </w:p>
     <w:p>
@@ -8021,10 +7923,11 @@
           <w:b/>
           <w:bCs/>
         </w:rPr>
-        <w:t>Example 3:</w:t>
-      </w:r>
-      <w:r>
-        <w:t xml:space="preserve"> Employee 196691EB spent $23.15 at CULVER'S OF COLUMB on 9/17/2014. </w:t>
+        <w:t xml:space="preserve">Example 3:</w:t>
+      </w:r>
+      <w:r>
+        <w:rPr/>
+        <w:t xml:space="preserve"> Employee 5C39F90C spent $1,033.46 and $973.51 at THE OLIVE GARDEN on 11/17/2014 and 11/7/2014. Amounts this large are more likely group or event meals and should be checked against the travel voucher.</w:t>
       </w:r>
     </w:p>
     <w:p>
@@ -8060,7 +7963,7 @@
       </w:r>
       <w:proofErr w:type="gramEnd"/>
       <w:r>
-        <w:t xml:space="preserve">  Student-defined internal-control test</w:t>
+        <w:t xml:space="preserve">  Alcohol may not be purchased with a P-card.</w:t>
       </w:r>
     </w:p>
     <w:p>
@@ -8076,15 +7979,7 @@
         <w:pStyle w:val="ControlFieldText"/>
       </w:pPr>
       <w:r>
-        <w:t xml:space="preserve">Define the </w:t>
-      </w:r>
-      <w:proofErr w:type="gramStart"/>
-      <w:r>
-        <w:t>student's</w:t>
-      </w:r>
-      <w:proofErr w:type="gramEnd"/>
-      <w:r>
-        <w:t xml:space="preserve"> additional internal-control question 1. State the control requirement or risk, explain the test to perform using 2014 data, and specify the fields and sorting required in the output.</w:t>
+        <w:t xml:space="preserve">Alcohol is a prohibited purchase under OSU's P-card procedure. Display the name, amount, vendor, description, transaction date and MCC for all 2014 transactions at liquor or package stores (MCC contains "liquor") or whose description mentions alcohol, wine or beer. Sort by amount, largest first.</w:t>
       </w:r>
     </w:p>
     <w:p>
@@ -8223,6 +8118,7 @@
         <w:ind w:left="115" w:right="115"/>
       </w:pPr>
       <w:r>
+        <w:rPr/>
         <w:t xml:space="preserve">The query returned </w:t>
       </w:r>
       <w:r>
@@ -8230,10 +8126,11 @@
           <w:b/>
           <w:bCs/>
         </w:rPr>
-        <w:t>45 rows</w:t>
-      </w:r>
-      <w:r>
-        <w:t xml:space="preserve"> representing transactions involving prohibited alcohol purchases or liquor vendors in calendar year 2014.</w:t>
+        <w:t xml:space="preserve">45 transactions</w:t>
+      </w:r>
+      <w:r>
+        <w:rPr/>
+        <w:t xml:space="preserve"> by 28 cardholders, totalling $21,900.84, involving alcohol or liquor vendors in calendar year 2014.</w:t>
       </w:r>
     </w:p>
     <w:p>
@@ -8258,10 +8155,11 @@
           <w:b/>
           <w:bCs/>
         </w:rPr>
-        <w:t>Top Violation:</w:t>
-      </w:r>
-      <w:r>
-        <w:t xml:space="preserve"> Employee 3B7AEC76 spent $4,151.05 at BROWNS BOTTLE SHOP.</w:t>
+        <w:t xml:space="preserve">Top Violation:</w:t>
+      </w:r>
+      <w:r>
+        <w:rPr/>
+        <w:t xml:space="preserve"> Employee 3B7AEC76 spent $4,151.05 at BROWNS BOTTLE SHOP on 5/20/2014.</w:t>
       </w:r>
     </w:p>
     <w:p>
@@ -8286,10 +8184,11 @@
           <w:b/>
           <w:bCs/>
         </w:rPr>
-        <w:t>Second Violation:</w:t>
-      </w:r>
-      <w:r>
-        <w:t xml:space="preserve"> Employee 3B7AEC76 spent $3,841.49 at BROWNS BOTTLE SHOP.</w:t>
+        <w:t xml:space="preserve">Second Violation:</w:t>
+      </w:r>
+      <w:r>
+        <w:rPr/>
+        <w:t xml:space="preserve"> Employee 3B7AEC76 spent $3,841.49 at BROWNS BOTTLE SHOP on 11/24/2014.</w:t>
       </w:r>
     </w:p>
     <w:p>
@@ -8314,10 +8213,11 @@
           <w:b/>
           <w:bCs/>
         </w:rPr>
-        <w:t>Third Violation:</w:t>
-      </w:r>
-      <w:r>
-        <w:t xml:space="preserve"> Employee 3B7AEC76 spent $3,433.51 at BROWNS BOTTLE SHOP.</w:t>
+        <w:t xml:space="preserve">Third Violation:</w:t>
+      </w:r>
+      <w:r>
+        <w:rPr/>
+        <w:t xml:space="preserve"> Employee 3B7AEC76 spent $3,433.51 at BROWNS BOTTLE SHOP on 12/16/2014. This employee made the four largest alcohol purchases and should be followed up first.</w:t>
       </w:r>
     </w:p>
     <w:p>
@@ -8342,10 +8242,11 @@
           <w:b/>
           <w:bCs/>
         </w:rPr>
-        <w:t>Other Notable Merchant:</w:t>
-      </w:r>
-      <w:r>
-        <w:t xml:space="preserve"> Employee C9E2DD2D spent $713.54 at BEELINE LIQUOR.</w:t>
+        <w:t xml:space="preserve">Other Notable Merchant:</w:t>
+      </w:r>
+      <w:r>
+        <w:rPr/>
+        <w:t xml:space="preserve"> Employee C8E2DD2D spent $713.54 at BEELINE LIQUOR.</w:t>
       </w:r>
     </w:p>
     <w:p>
@@ -8362,7 +8263,7 @@
       </w:r>
       <w:proofErr w:type="gramEnd"/>
       <w:r>
-        <w:t xml:space="preserve">  Student-defined internal-control test</w:t>
+        <w:t xml:space="preserve">  Gasoline may not be purchased with a P-card.</w:t>
       </w:r>
     </w:p>
     <w:p>
@@ -8378,7 +8279,7 @@
         <w:pStyle w:val="ControlFieldText"/>
       </w:pPr>
       <w:r>
-        <w:t>Define the student's additional internal-control question 2. State the control requirement or risk, explain the test to perform using 2014 data, and specify the fields and sorting required in the output.</w:t>
+        <w:t xml:space="preserve">Gasoline must be bought from Transportation Services or with the fuel card provided with each university vehicle. Display the name, amount, vendor, description, transaction date and MCC for all 2014 transactions at service stations or automated fuel dispensers (based on the MCC) or whose description mentions gasoline or unleaded fuel. Utility bills for natural gas are deliberately excluded because they are not gasoline. Sort by amount, largest first.</w:t>
       </w:r>
     </w:p>
     <w:p>
@@ -8403,23 +8304,7 @@
         <w:ind w:left="115" w:right="115"/>
       </w:pPr>
       <w:r>
-        <w:t xml:space="preserve">SELECT </w:t>
-      </w:r>
-      <w:proofErr w:type="spellStart"/>
-      <w:r>
-        <w:t>FullName</w:t>
-      </w:r>
-      <w:proofErr w:type="spellEnd"/>
-      <w:r>
-        <w:t xml:space="preserve">, Amount, Vendor, Description, </w:t>
-      </w:r>
-      <w:proofErr w:type="spellStart"/>
-      <w:r>
-        <w:t>TransactionDate</w:t>
-      </w:r>
-      <w:proofErr w:type="spellEnd"/>
-      <w:r>
-        <w:t>, MCC</w:t>
+        <w:t xml:space="preserve">SELECT FullName, Amount, Vendor, Description, TransactionDate, MCC</w:t>
       </w:r>
     </w:p>
     <w:p>
@@ -8436,13 +8321,8 @@
         <w:ind w:left="115" w:right="115"/>
       </w:pPr>
       <w:r>
-        <w:t xml:space="preserve">FROM </w:t>
-      </w:r>
-      <w:proofErr w:type="spellStart"/>
-      <w:r>
-        <w:t>pcards</w:t>
-      </w:r>
-      <w:proofErr w:type="spellEnd"/>
+        <w:t xml:space="preserve">FROM pcards</w:t>
+      </w:r>
     </w:p>
     <w:p>
       <w:pPr>
@@ -8458,7 +8338,7 @@
         <w:ind w:left="115" w:right="115"/>
       </w:pPr>
       <w:r>
-        <w:t xml:space="preserve">WHERE Year = 2014 </w:t>
+        <w:t xml:space="preserve">WHERE Year = 2014</w:t>
       </w:r>
     </w:p>
     <w:p>
@@ -8475,7 +8355,7 @@
         <w:ind w:left="115" w:right="115"/>
       </w:pPr>
       <w:r>
-        <w:t xml:space="preserve">  AND (MCC LIKE '%gas%' OR Vendor LIKE '%fuel%' OR Vendor LIKE '%gas station%' OR Description LIKE '%gasoline%')</w:t>
+        <w:t xml:space="preserve">  AND (MCC LIKE 'SERVICE STATIONS%'</w:t>
       </w:r>
     </w:p>
     <w:p>
@@ -8492,15 +8372,58 @@
         <w:ind w:left="115" w:right="115"/>
       </w:pPr>
       <w:r>
-        <w:t xml:space="preserve">ORDER BY </w:t>
-      </w:r>
-      <w:proofErr w:type="spellStart"/>
-      <w:r>
-        <w:t>TransactionDate</w:t>
-      </w:r>
-      <w:proofErr w:type="spellEnd"/>
-      <w:r>
-        <w:t xml:space="preserve"> ASC;</w:t>
+        <w:t xml:space="preserve">       OR MCC LIKE 'AUTOMATED FUEL DISPENSER%'</w:t>
+      </w:r>
+    </w:p>
+    <w:p>
+      <w:pPr>
+        <w:pStyle w:val="SQLQueryBlock"/>
+        <w:pBdr>
+          <w:top w:val="single" w:sz="4" w:space="4" w:color="B7C1CC"/>
+          <w:left w:val="single" w:sz="4" w:space="4" w:color="B7C1CC"/>
+          <w:bottom w:val="single" w:sz="4" w:space="4" w:color="B7C1CC"/>
+          <w:right w:val="single" w:sz="4" w:space="4" w:color="B7C1CC"/>
+        </w:pBdr>
+        <w:shd w:val="clear" w:color="auto" w:fill="F3F5F7"/>
+        <w:spacing w:before="40" w:after="120"/>
+        <w:ind w:left="115" w:right="115"/>
+      </w:pPr>
+      <w:r>
+        <w:t xml:space="preserve">       OR Description LIKE '%gasoline%'</w:t>
+      </w:r>
+    </w:p>
+    <w:p>
+      <w:pPr>
+        <w:pStyle w:val="SQLQueryBlock"/>
+        <w:pBdr>
+          <w:top w:val="single" w:sz="4" w:space="4" w:color="B7C1CC"/>
+          <w:left w:val="single" w:sz="4" w:space="4" w:color="B7C1CC"/>
+          <w:bottom w:val="single" w:sz="4" w:space="4" w:color="B7C1CC"/>
+          <w:right w:val="single" w:sz="4" w:space="4" w:color="B7C1CC"/>
+        </w:pBdr>
+        <w:shd w:val="clear" w:color="auto" w:fill="F3F5F7"/>
+        <w:spacing w:before="40" w:after="120"/>
+        <w:ind w:left="115" w:right="115"/>
+      </w:pPr>
+      <w:r>
+        <w:t xml:space="preserve">       OR Description LIKE '%unleaded%')</w:t>
+      </w:r>
+    </w:p>
+    <w:p>
+      <w:pPr>
+        <w:pStyle w:val="SQLQueryBlock"/>
+        <w:pBdr>
+          <w:top w:val="single" w:sz="4" w:space="4" w:color="B7C1CC"/>
+          <w:left w:val="single" w:sz="4" w:space="4" w:color="B7C1CC"/>
+          <w:bottom w:val="single" w:sz="4" w:space="4" w:color="B7C1CC"/>
+          <w:right w:val="single" w:sz="4" w:space="4" w:color="B7C1CC"/>
+        </w:pBdr>
+        <w:shd w:val="clear" w:color="auto" w:fill="F3F5F7"/>
+        <w:spacing w:before="40" w:after="120"/>
+        <w:ind w:left="115" w:right="115"/>
+      </w:pPr>
+      <w:r>
+        <w:t xml:space="preserve">ORDER BY Amount DESC;</w:t>
       </w:r>
     </w:p>
     <w:p>
@@ -8525,6 +8448,7 @@
         <w:ind w:left="115" w:right="115"/>
       </w:pPr>
       <w:r>
+        <w:rPr/>
         <w:t xml:space="preserve">The query returned </w:t>
       </w:r>
       <w:r>
@@ -8532,10 +8456,11 @@
           <w:b/>
           <w:bCs/>
         </w:rPr>
-        <w:t>436 rows</w:t>
-      </w:r>
-      <w:r>
-        <w:t xml:space="preserve"> representing potential fuel/gasoline or utility gas purchases in calendar year 2014.</w:t>
+        <w:t xml:space="preserve">581 transactions</w:t>
+      </w:r>
+      <w:r>
+        <w:rPr/>
+        <w:t xml:space="preserve"> by 157 cardholders, totalling $234,412.95 (469 at service stations and 112 at automated fuel dispensers).</w:t>
       </w:r>
     </w:p>
     <w:p>
@@ -8560,11 +8485,11 @@
           <w:b/>
           <w:bCs/>
         </w:rPr>
-        <w:lastRenderedPageBreak/>
-        <w:t>Example 1:</w:t>
-      </w:r>
-      <w:r>
-        <w:t xml:space="preserve"> Employee 03B266AF made two transactions at OK NATURAL GAS/TNB ($229.46 and $115.76) on 1/10/2014.</w:t>
+        <w:t xml:space="preserve">Largest:</w:t>
+      </w:r>
+      <w:r>
+        <w:rPr/>
+        <w:t xml:space="preserve"> Employee 75B5564A spent $4,075.00 at BURK OIL CO INC on 9/17/2014.</w:t>
       </w:r>
     </w:p>
     <w:p>
@@ -8589,10 +8514,11 @@
           <w:b/>
           <w:bCs/>
         </w:rPr>
-        <w:t>Example 2:</w:t>
-      </w:r>
-      <w:r>
-        <w:t xml:space="preserve"> Employee 21190BED spent $50.00 at TRASHBILLING COM CO on 1/13/2014.</w:t>
+        <w:t xml:space="preserve">Second Largest:</w:t>
+      </w:r>
+      <w:r>
+        <w:rPr/>
+        <w:t xml:space="preserve"> Employee 14C66547 spent $3,956.64 at BURK OIL CO INC on 8/19/2014.</w:t>
       </w:r>
     </w:p>
     <w:p>
@@ -8617,10 +8543,11 @@
           <w:b/>
           <w:bCs/>
         </w:rPr>
-        <w:t>Example 3:</w:t>
-      </w:r>
-      <w:r>
-        <w:t xml:space="preserve"> Employee 0574B3DD spent $550.00 at CENTRAL RURAL ELECTRIC C on 1/14/2014.</w:t>
+        <w:t xml:space="preserve">Third Largest:</w:t>
+      </w:r>
+      <w:r>
+        <w:rPr/>
+        <w:t xml:space="preserve"> Employee 75B5564A spent $3,868.48 at BURK OIL CO INC on 10/13/2014. The large, repeated BURK OIL amounts look like bulk fuel for farm or field equipment, which may be covered by an exception, but this should be confirmed.</w:t>
       </w:r>
     </w:p>
     <w:p>
@@ -8637,7 +8564,7 @@
       </w:r>
       <w:proofErr w:type="gramEnd"/>
       <w:r>
-        <w:t xml:space="preserve">  Student-defined internal-control test</w:t>
+        <w:t xml:space="preserve">  Gift cards may not be purchased with a P-card.</w:t>
       </w:r>
     </w:p>
     <w:p>
@@ -8653,7 +8580,7 @@
         <w:pStyle w:val="ControlFieldText"/>
       </w:pPr>
       <w:r>
-        <w:t>Define the student's additional internal-control question 3. State the control requirement or risk, explain the test to perform using 2014 data, and specify the fields and sorting required in the output.</w:t>
+        <w:t xml:space="preserve">Gifts, gift cards and gift certificates are prohibited because purchasing gifts violates state statutes. Display the name, amount, vendor, description and transaction date for all 2014 transactions whose description contains "gift card". Sort by amount, largest first.</w:t>
       </w:r>
     </w:p>
     <w:p>
@@ -8855,7 +8782,7 @@
       </w:r>
       <w:proofErr w:type="gramEnd"/>
       <w:r>
-        <w:t xml:space="preserve">  Student-defined internal-control test</w:t>
+        <w:t xml:space="preserve">  Purchases should not be priced just below the $5,000 limit.</w:t>
       </w:r>
     </w:p>
     <w:p>
@@ -8871,15 +8798,7 @@
         <w:pStyle w:val="ControlFieldText"/>
       </w:pPr>
       <w:r>
-        <w:t xml:space="preserve">Define the </w:t>
-      </w:r>
-      <w:proofErr w:type="gramStart"/>
-      <w:r>
-        <w:t>student's</w:t>
-      </w:r>
-      <w:proofErr w:type="gramEnd"/>
-      <w:r>
-        <w:t xml:space="preserve"> additional internal-control question 4. State the control requirement or risk, explain the test to perform using 2014 data, and specify the fields and sorting required in the output.</w:t>
+        <w:t xml:space="preserve">A cardholder who wants to avoid the $5,000 single-transaction limit or a bidding requirement may keep purchases just below it. Display the name, amount, vendor, description and transaction date for all 2014 transactions between $4,900.00 and $4,999.99. Sort by amount, largest first.</w:t>
       </w:r>
     </w:p>
     <w:p>
@@ -8998,6 +8917,7 @@
         <w:ind w:left="115" w:right="115"/>
       </w:pPr>
       <w:r>
+        <w:rPr/>
         <w:t xml:space="preserve">The query returned </w:t>
       </w:r>
       <w:r>
@@ -9005,10 +8925,11 @@
           <w:b/>
           <w:bCs/>
         </w:rPr>
-        <w:t>53 rows</w:t>
-      </w:r>
-      <w:r>
-        <w:t xml:space="preserve"> representing transactions structured between $4,900.00 and $4,999.99 during calendar year 2014.</w:t>
+        <w:t xml:space="preserve">93 transactions</w:t>
+      </w:r>
+      <w:r>
+        <w:rPr/>
+        <w:t xml:space="preserve"> by 70 cardholders between $4,900.00 and $4,999.99. For comparison, only 51 transactions fall in the $4,800.00–$4,899.99 range, so purchases cluster just under the limit.</w:t>
       </w:r>
     </w:p>
     <w:p>
@@ -9033,10 +8954,11 @@
           <w:b/>
           <w:bCs/>
         </w:rPr>
-        <w:t>Top Amount:</w:t>
-      </w:r>
-      <w:r>
-        <w:t xml:space="preserve"> Employee 9A88A582 spent $4,999.99 at GORON PIPE AND STEEL S for GENERAL PURCHASE.</w:t>
+        <w:t xml:space="preserve">Top Amount:</w:t>
+      </w:r>
+      <w:r>
+        <w:rPr/>
+        <w:t xml:space="preserve"> Employee 9A88A592 spent $4,999.99 at GOBOB PIPE AND STEEL S for GENERAL PURCHASE.</w:t>
       </w:r>
     </w:p>
     <w:p>
@@ -9061,9 +8983,10 @@
           <w:b/>
           <w:bCs/>
         </w:rPr>
-        <w:t>Second Top Amount:</w:t>
-      </w:r>
-      <w:r>
+        <w:t xml:space="preserve">Second Top Amount:</w:t>
+      </w:r>
+      <w:r>
+        <w:rPr/>
         <w:t xml:space="preserve"> Employee 14C66547 spent $4,999.99 at UNITED RENTALS #018223 for PAYMENT ON ACCOUNT EA.</w:t>
       </w:r>
     </w:p>
@@ -9089,11 +9012,11 @@
           <w:b/>
           <w:bCs/>
         </w:rPr>
-        <w:lastRenderedPageBreak/>
-        <w:t>Third Top Amount:</w:t>
-      </w:r>
-      <w:r>
-        <w:t xml:space="preserve"> Employee DC086243 spent $4,999.95 at CORE BUSINESS SERVICES for GENERAL PURCHASE.</w:t>
+        <w:t xml:space="preserve">Third Top Amount:</w:t>
+      </w:r>
+      <w:r>
+        <w:rPr/>
+        <w:t xml:space="preserve"> Employee DC886243 spent $4,999.95 at CORE BUSINESS SERVICES for GENERAL PURCHASE.</w:t>
       </w:r>
     </w:p>
     <w:p>
@@ -9118,10 +9041,11 @@
           <w:b/>
           <w:bCs/>
         </w:rPr>
-        <w:t>Other High-Value Examples:</w:t>
-      </w:r>
-      <w:r>
-        <w:t xml:space="preserve"> Employee 465E5080 ($4,999.75 at PPG PROFORMA), Employee 104ADF07 ($4,999.60 at ALIENVAULT, LLC), and Employee 51914657 ($4,999.35 at THE LEE COMPANY).</w:t>
+        <w:t xml:space="preserve">Other High-Value Examples:</w:t>
+      </w:r>
+      <w:r>
+        <w:rPr/>
+        <w:t xml:space="preserve"> Employee 465E5080 ($4,999.75 at PFG PROFORMA), Employee 144ADF87 ($4,999.68 at ALIENVAULT, LLC) and Employee 51914657 ($4,999.35 at THE LEE COMPANY).</w:t>
       </w:r>
     </w:p>
     <w:p>
@@ -9138,7 +9062,7 @@
       </w:r>
       <w:proofErr w:type="gramEnd"/>
       <w:r>
-        <w:t xml:space="preserve">  Student-defined internal-control test</w:t>
+        <w:t xml:space="preserve">  Postage must be sent through University Mailing.</w:t>
       </w:r>
     </w:p>
     <w:p>
@@ -9154,15 +9078,7 @@
         <w:pStyle w:val="ControlFieldText"/>
       </w:pPr>
       <w:r>
-        <w:t xml:space="preserve">Define the </w:t>
-      </w:r>
-      <w:proofErr w:type="gramStart"/>
-      <w:r>
-        <w:t>student's</w:t>
-      </w:r>
-      <w:proofErr w:type="gramEnd"/>
-      <w:r>
-        <w:t xml:space="preserve"> additional internal-control question 5. State the control requirement or risk, explain the test to perform using 2014 data, and specify the fields and sorting required in the output.</w:t>
+        <w:t xml:space="preserve">All U.S. mail must be sent through University Mailing, so postage may not be bought with a P-card. Display the name, amount, vendor, description and transaction date for all 2014 transactions where the vendor contains "USPS" or "POST OFFICE". Sort by amount, largest first.</w:t>
       </w:r>
     </w:p>
     <w:p>
@@ -9281,6 +9197,7 @@
         <w:ind w:left="115" w:right="115"/>
       </w:pPr>
       <w:r>
+        <w:rPr/>
         <w:t xml:space="preserve">The query returned </w:t>
       </w:r>
       <w:r>
@@ -9288,10 +9205,11 @@
           <w:b/>
           <w:bCs/>
         </w:rPr>
-        <w:t>23 rows</w:t>
-      </w:r>
-      <w:r>
-        <w:t xml:space="preserve"> representing prohibited postal and shipping transactions involving postal vendors in calendar year 2014.</w:t>
+        <w:t xml:space="preserve">23 transactions</w:t>
+      </w:r>
+      <w:r>
+        <w:rPr/>
+        <w:t xml:space="preserve"> with postal vendors in calendar year 2014. Seven of these ($651.00) are hotel charges at MARRIOTT USPS CONFERENCE and are false positives, which leaves 16 likely postage purchases.</w:t>
       </w:r>
     </w:p>
     <w:p>
@@ -9316,10 +9234,11 @@
           <w:b/>
           <w:bCs/>
         </w:rPr>
-        <w:t>Top Violation:</w:t>
-      </w:r>
-      <w:r>
-        <w:t xml:space="preserve"> Employee 48164054 spent $1,218.00 at USPS 39781002033603457 on 5/13/2014.</w:t>
+        <w:t xml:space="preserve">Top Violation:</w:t>
+      </w:r>
+      <w:r>
+        <w:rPr/>
+        <w:t xml:space="preserve"> Employee 48164094 spent $1,218.00 at USPS 39781002033603457 on 5/13/2014.</w:t>
       </w:r>
     </w:p>
     <w:p>
@@ -9344,9 +9263,10 @@
           <w:b/>
           <w:bCs/>
         </w:rPr>
-        <w:t>Second Highest Violation:</w:t>
-      </w:r>
-      <w:r>
+        <w:t xml:space="preserve">Second Highest Violation:</w:t>
+      </w:r>
+      <w:r>
+        <w:rPr/>
         <w:t xml:space="preserve"> Employee ED551321 spent $1,035.00 at USPS 39614100033600891 on 1/16/2014.</w:t>
       </w:r>
     </w:p>
@@ -9372,10 +9292,11 @@
           <w:b/>
           <w:bCs/>
         </w:rPr>
-        <w:t>Third Highest Violation:</w:t>
-      </w:r>
-      <w:r>
-        <w:t xml:space="preserve"> Employee D2EF2D35 spent $905.00 at USPS 39791002033603457 on 2/19/2014.</w:t>
+        <w:t xml:space="preserve">Third Highest Violation:</w:t>
+      </w:r>
+      <w:r>
+        <w:rPr/>
+        <w:t xml:space="preserve"> Employee D2EF2D35 spent $905.00 at USPS 39781002033603457 on 2/18/2014.</w:t>
       </w:r>
     </w:p>
     <w:p>
@@ -9392,7 +9313,7 @@
       </w:r>
       <w:proofErr w:type="gramEnd"/>
       <w:r>
-        <w:t xml:space="preserve">  Student-defined internal-control test</w:t>
+        <w:t xml:space="preserve">  Weekend purchases need extra review.</w:t>
       </w:r>
     </w:p>
     <w:p>
@@ -9408,15 +9329,7 @@
         <w:pStyle w:val="ControlFieldText"/>
       </w:pPr>
       <w:r>
-        <w:t xml:space="preserve">Define the </w:t>
-      </w:r>
-      <w:proofErr w:type="gramStart"/>
-      <w:r>
-        <w:t>student's</w:t>
-      </w:r>
-      <w:proofErr w:type="gramEnd"/>
-      <w:r>
-        <w:t xml:space="preserve"> additional internal-control question 6. State the control requirement or risk, explain the test to perform using 2014 data, and specify the fields and sorting required in the output.</w:t>
+        <w:t xml:space="preserve">University business purchases are normally made on working days, so weekend purchases have a higher risk of being personal. Display the name, amount, vendor, description, transaction date and weekday for all 2014 transactions made on a Saturday or Sunday. Dates are stored as text in M/D/YYYY format without leading zeros, so the query first converts them into real dates. Sort by date, then cardholder.</w:t>
       </w:r>
     </w:p>
     <w:p>
@@ -9441,21 +9354,8 @@
         <w:ind w:left="115" w:right="115"/>
       </w:pPr>
       <w:r>
-        <w:t xml:space="preserve">SELECT </w:t>
-      </w:r>
-      <w:proofErr w:type="spellStart"/>
-      <w:r>
-        <w:t>FullName</w:t>
-      </w:r>
-      <w:proofErr w:type="spellEnd"/>
-      <w:r>
-        <w:t xml:space="preserve">, Amount, Vendor, Description, </w:t>
-      </w:r>
-      <w:proofErr w:type="spellStart"/>
-      <w:r>
-        <w:t>TransactionDate</w:t>
-      </w:r>
-      <w:proofErr w:type="spellEnd"/>
+        <w:t xml:space="preserve">WITH parsed AS (</w:t>
+      </w:r>
     </w:p>
     <w:p>
       <w:pPr>
@@ -9471,13 +9371,8 @@
         <w:ind w:left="115" w:right="115"/>
       </w:pPr>
       <w:r>
-        <w:t xml:space="preserve">FROM </w:t>
-      </w:r>
-      <w:proofErr w:type="spellStart"/>
-      <w:r>
-        <w:t>pcards</w:t>
-      </w:r>
-      <w:proofErr w:type="spellEnd"/>
+        <w:t xml:space="preserve">    SELECT *,</w:t>
+      </w:r>
     </w:p>
     <w:p>
       <w:pPr>
@@ -9493,7 +9388,7 @@
         <w:ind w:left="115" w:right="115"/>
       </w:pPr>
       <w:r>
-        <w:t xml:space="preserve">WHERE Year = 2014 </w:t>
+        <w:t xml:space="preserve">        CAST(substr(TransactionDate, 1, instr(TransactionDate, '/') - 1) AS INT) AS m,</w:t>
       </w:r>
     </w:p>
     <w:p>
@@ -9510,20 +9405,7 @@
         <w:ind w:left="115" w:right="115"/>
       </w:pPr>
       <w:r>
-        <w:t xml:space="preserve">  AND </w:t>
-      </w:r>
-      <w:proofErr w:type="spellStart"/>
-      <w:proofErr w:type="gramStart"/>
-      <w:r>
-        <w:t>strftime</w:t>
-      </w:r>
-      <w:proofErr w:type="spellEnd"/>
-      <w:r>
-        <w:t>(</w:t>
-      </w:r>
-      <w:proofErr w:type="gramEnd"/>
-      <w:r>
-        <w:t xml:space="preserve">'%w', </w:t>
+        <w:t xml:space="preserve">        substr(TransactionDate, instr(TransactionDate, '/') + 1) AS rest</w:t>
       </w:r>
     </w:p>
     <w:p>
@@ -9540,25 +9422,7 @@
         <w:ind w:left="115" w:right="115"/>
       </w:pPr>
       <w:r>
-        <w:t xml:space="preserve">        </w:t>
-      </w:r>
-      <w:proofErr w:type="spellStart"/>
-      <w:proofErr w:type="gramStart"/>
-      <w:r>
-        <w:t>substr</w:t>
-      </w:r>
-      <w:proofErr w:type="spellEnd"/>
-      <w:r>
-        <w:t>(</w:t>
-      </w:r>
-      <w:proofErr w:type="spellStart"/>
-      <w:proofErr w:type="gramEnd"/>
-      <w:r>
-        <w:t>TransactionDate</w:t>
-      </w:r>
-      <w:proofErr w:type="spellEnd"/>
-      <w:r>
-        <w:t xml:space="preserve">, 7, 4) || '-' || </w:t>
+        <w:t xml:space="preserve">    FROM pcards</w:t>
       </w:r>
     </w:p>
     <w:p>
@@ -9575,59 +9439,7 @@
         <w:ind w:left="115" w:right="115"/>
       </w:pPr>
       <w:r>
-        <w:t xml:space="preserve">        </w:t>
-      </w:r>
-      <w:proofErr w:type="spellStart"/>
-      <w:proofErr w:type="gramStart"/>
-      <w:r>
-        <w:t>printf</w:t>
-      </w:r>
-      <w:proofErr w:type="spellEnd"/>
-      <w:r>
-        <w:t>(</w:t>
-      </w:r>
-      <w:proofErr w:type="gramEnd"/>
-      <w:r>
-        <w:t xml:space="preserve">'%02d', </w:t>
-      </w:r>
-      <w:proofErr w:type="gramStart"/>
-      <w:r>
-        <w:t>CAST(</w:t>
-      </w:r>
-      <w:proofErr w:type="spellStart"/>
-      <w:r>
-        <w:t>substr</w:t>
-      </w:r>
-      <w:proofErr w:type="spellEnd"/>
-      <w:r>
-        <w:t>(</w:t>
-      </w:r>
-      <w:proofErr w:type="spellStart"/>
-      <w:proofErr w:type="gramEnd"/>
-      <w:r>
-        <w:t>TransactionDate</w:t>
-      </w:r>
-      <w:proofErr w:type="spellEnd"/>
-      <w:r>
-        <w:t xml:space="preserve">, 1, </w:t>
-      </w:r>
-      <w:proofErr w:type="spellStart"/>
-      <w:proofErr w:type="gramStart"/>
-      <w:r>
-        <w:t>instr</w:t>
-      </w:r>
-      <w:proofErr w:type="spellEnd"/>
-      <w:r>
-        <w:t>(</w:t>
-      </w:r>
-      <w:proofErr w:type="spellStart"/>
-      <w:proofErr w:type="gramEnd"/>
-      <w:r>
-        <w:t>TransactionDate</w:t>
-      </w:r>
-      <w:proofErr w:type="spellEnd"/>
-      <w:r>
-        <w:t xml:space="preserve">, '/') - 1) AS INT)) || '-' || </w:t>
+        <w:t xml:space="preserve">    WHERE Year = 2014</w:t>
       </w:r>
     </w:p>
     <w:p>
@@ -9644,103 +9456,7 @@
         <w:ind w:left="115" w:right="115"/>
       </w:pPr>
       <w:r>
-        <w:t xml:space="preserve">        </w:t>
-      </w:r>
-      <w:proofErr w:type="spellStart"/>
-      <w:proofErr w:type="gramStart"/>
-      <w:r>
-        <w:t>printf</w:t>
-      </w:r>
-      <w:proofErr w:type="spellEnd"/>
-      <w:r>
-        <w:t>(</w:t>
-      </w:r>
-      <w:proofErr w:type="gramEnd"/>
-      <w:r>
-        <w:t xml:space="preserve">'%02d', </w:t>
-      </w:r>
-      <w:proofErr w:type="gramStart"/>
-      <w:r>
-        <w:t>CAST(</w:t>
-      </w:r>
-      <w:proofErr w:type="spellStart"/>
-      <w:r>
-        <w:t>substr</w:t>
-      </w:r>
-      <w:proofErr w:type="spellEnd"/>
-      <w:r>
-        <w:t>(</w:t>
-      </w:r>
-      <w:proofErr w:type="spellStart"/>
-      <w:proofErr w:type="gramEnd"/>
-      <w:r>
-        <w:t>TransactionDate</w:t>
-      </w:r>
-      <w:proofErr w:type="spellEnd"/>
-      <w:r>
-        <w:t xml:space="preserve">, </w:t>
-      </w:r>
-      <w:proofErr w:type="spellStart"/>
-      <w:proofErr w:type="gramStart"/>
-      <w:r>
-        <w:t>instr</w:t>
-      </w:r>
-      <w:proofErr w:type="spellEnd"/>
-      <w:r>
-        <w:t>(</w:t>
-      </w:r>
-      <w:proofErr w:type="spellStart"/>
-      <w:proofErr w:type="gramEnd"/>
-      <w:r>
-        <w:t>TransactionDate</w:t>
-      </w:r>
-      <w:proofErr w:type="spellEnd"/>
-      <w:r>
-        <w:t xml:space="preserve">, '/') + 1, </w:t>
-      </w:r>
-      <w:proofErr w:type="spellStart"/>
-      <w:proofErr w:type="gramStart"/>
-      <w:r>
-        <w:t>instr</w:t>
-      </w:r>
-      <w:proofErr w:type="spellEnd"/>
-      <w:r>
-        <w:t>(</w:t>
-      </w:r>
-      <w:proofErr w:type="spellStart"/>
-      <w:r>
-        <w:t>substr</w:t>
-      </w:r>
-      <w:proofErr w:type="spellEnd"/>
-      <w:r>
-        <w:t>(</w:t>
-      </w:r>
-      <w:proofErr w:type="spellStart"/>
-      <w:proofErr w:type="gramEnd"/>
-      <w:r>
-        <w:t>TransactionDate</w:t>
-      </w:r>
-      <w:proofErr w:type="spellEnd"/>
-      <w:r>
-        <w:t xml:space="preserve">, </w:t>
-      </w:r>
-      <w:proofErr w:type="spellStart"/>
-      <w:proofErr w:type="gramStart"/>
-      <w:r>
-        <w:t>instr</w:t>
-      </w:r>
-      <w:proofErr w:type="spellEnd"/>
-      <w:r>
-        <w:t>(</w:t>
-      </w:r>
-      <w:proofErr w:type="spellStart"/>
-      <w:proofErr w:type="gramEnd"/>
-      <w:r>
-        <w:t>TransactionDate</w:t>
-      </w:r>
-      <w:proofErr w:type="spellEnd"/>
-      <w:r>
-        <w:t>, '/') + 1), '/') - 1) AS INT))</w:t>
+        <w:t xml:space="preserve">),</w:t>
       </w:r>
     </w:p>
     <w:p>
@@ -9757,7 +9473,7 @@
         <w:ind w:left="115" w:right="115"/>
       </w:pPr>
       <w:r>
-        <w:t xml:space="preserve">      ) IN ('0', '6')</w:t>
+        <w:t xml:space="preserve">dated AS (</w:t>
       </w:r>
     </w:p>
     <w:p>
@@ -9774,15 +9490,160 @@
         <w:ind w:left="115" w:right="115"/>
       </w:pPr>
       <w:r>
-        <w:t xml:space="preserve">ORDER BY </w:t>
-      </w:r>
-      <w:proofErr w:type="spellStart"/>
-      <w:r>
-        <w:t>TransactionDate</w:t>
-      </w:r>
-      <w:proofErr w:type="spellEnd"/>
-      <w:r>
-        <w:t xml:space="preserve"> ASC;</w:t>
+        <w:t xml:space="preserve">    SELECT *,</w:t>
+      </w:r>
+    </w:p>
+    <w:p>
+      <w:pPr>
+        <w:pStyle w:val="SQLQueryBlock"/>
+        <w:pBdr>
+          <w:top w:val="single" w:sz="4" w:space="4" w:color="B7C1CC"/>
+          <w:left w:val="single" w:sz="4" w:space="4" w:color="B7C1CC"/>
+          <w:bottom w:val="single" w:sz="4" w:space="4" w:color="B7C1CC"/>
+          <w:right w:val="single" w:sz="4" w:space="4" w:color="B7C1CC"/>
+        </w:pBdr>
+        <w:shd w:val="clear" w:color="auto" w:fill="F3F5F7"/>
+        <w:spacing w:before="40" w:after="120"/>
+        <w:ind w:left="115" w:right="115"/>
+      </w:pPr>
+      <w:r>
+        <w:t xml:space="preserve">        date(substr(rest, instr(rest, '/') + 1, 4) || '-' || printf('%02d', m) || '-' ||</w:t>
+      </w:r>
+    </w:p>
+    <w:p>
+      <w:pPr>
+        <w:pStyle w:val="SQLQueryBlock"/>
+        <w:pBdr>
+          <w:top w:val="single" w:sz="4" w:space="4" w:color="B7C1CC"/>
+          <w:left w:val="single" w:sz="4" w:space="4" w:color="B7C1CC"/>
+          <w:bottom w:val="single" w:sz="4" w:space="4" w:color="B7C1CC"/>
+          <w:right w:val="single" w:sz="4" w:space="4" w:color="B7C1CC"/>
+        </w:pBdr>
+        <w:shd w:val="clear" w:color="auto" w:fill="F3F5F7"/>
+        <w:spacing w:before="40" w:after="120"/>
+        <w:ind w:left="115" w:right="115"/>
+      </w:pPr>
+      <w:r>
+        <w:t xml:space="preserve">             printf('%02d', CAST(substr(rest, 1, instr(rest, '/') - 1) AS INT))) AS TxDate</w:t>
+      </w:r>
+    </w:p>
+    <w:p>
+      <w:pPr>
+        <w:pStyle w:val="SQLQueryBlock"/>
+        <w:pBdr>
+          <w:top w:val="single" w:sz="4" w:space="4" w:color="B7C1CC"/>
+          <w:left w:val="single" w:sz="4" w:space="4" w:color="B7C1CC"/>
+          <w:bottom w:val="single" w:sz="4" w:space="4" w:color="B7C1CC"/>
+          <w:right w:val="single" w:sz="4" w:space="4" w:color="B7C1CC"/>
+        </w:pBdr>
+        <w:shd w:val="clear" w:color="auto" w:fill="F3F5F7"/>
+        <w:spacing w:before="40" w:after="120"/>
+        <w:ind w:left="115" w:right="115"/>
+      </w:pPr>
+      <w:r>
+        <w:t xml:space="preserve">    FROM parsed</w:t>
+      </w:r>
+    </w:p>
+    <w:p>
+      <w:pPr>
+        <w:pStyle w:val="SQLQueryBlock"/>
+        <w:pBdr>
+          <w:top w:val="single" w:sz="4" w:space="4" w:color="B7C1CC"/>
+          <w:left w:val="single" w:sz="4" w:space="4" w:color="B7C1CC"/>
+          <w:bottom w:val="single" w:sz="4" w:space="4" w:color="B7C1CC"/>
+          <w:right w:val="single" w:sz="4" w:space="4" w:color="B7C1CC"/>
+        </w:pBdr>
+        <w:shd w:val="clear" w:color="auto" w:fill="F3F5F7"/>
+        <w:spacing w:before="40" w:after="120"/>
+        <w:ind w:left="115" w:right="115"/>
+      </w:pPr>
+      <w:r>
+        <w:t xml:space="preserve">)</w:t>
+      </w:r>
+    </w:p>
+    <w:p>
+      <w:pPr>
+        <w:pStyle w:val="SQLQueryBlock"/>
+        <w:pBdr>
+          <w:top w:val="single" w:sz="4" w:space="4" w:color="B7C1CC"/>
+          <w:left w:val="single" w:sz="4" w:space="4" w:color="B7C1CC"/>
+          <w:bottom w:val="single" w:sz="4" w:space="4" w:color="B7C1CC"/>
+          <w:right w:val="single" w:sz="4" w:space="4" w:color="B7C1CC"/>
+        </w:pBdr>
+        <w:shd w:val="clear" w:color="auto" w:fill="F3F5F7"/>
+        <w:spacing w:before="40" w:after="120"/>
+        <w:ind w:left="115" w:right="115"/>
+      </w:pPr>
+      <w:r>
+        <w:t xml:space="preserve">SELECT FullName, Amount, Vendor, Description, TransactionDate,</w:t>
+      </w:r>
+    </w:p>
+    <w:p>
+      <w:pPr>
+        <w:pStyle w:val="SQLQueryBlock"/>
+        <w:pBdr>
+          <w:top w:val="single" w:sz="4" w:space="4" w:color="B7C1CC"/>
+          <w:left w:val="single" w:sz="4" w:space="4" w:color="B7C1CC"/>
+          <w:bottom w:val="single" w:sz="4" w:space="4" w:color="B7C1CC"/>
+          <w:right w:val="single" w:sz="4" w:space="4" w:color="B7C1CC"/>
+        </w:pBdr>
+        <w:shd w:val="clear" w:color="auto" w:fill="F3F5F7"/>
+        <w:spacing w:before="40" w:after="120"/>
+        <w:ind w:left="115" w:right="115"/>
+      </w:pPr>
+      <w:r>
+        <w:t xml:space="preserve">    CASE strftime('%w', TxDate) WHEN '0' THEN 'Sunday' ELSE 'Saturday' END AS Weekday</w:t>
+      </w:r>
+    </w:p>
+    <w:p>
+      <w:pPr>
+        <w:pStyle w:val="SQLQueryBlock"/>
+        <w:pBdr>
+          <w:top w:val="single" w:sz="4" w:space="4" w:color="B7C1CC"/>
+          <w:left w:val="single" w:sz="4" w:space="4" w:color="B7C1CC"/>
+          <w:bottom w:val="single" w:sz="4" w:space="4" w:color="B7C1CC"/>
+          <w:right w:val="single" w:sz="4" w:space="4" w:color="B7C1CC"/>
+        </w:pBdr>
+        <w:shd w:val="clear" w:color="auto" w:fill="F3F5F7"/>
+        <w:spacing w:before="40" w:after="120"/>
+        <w:ind w:left="115" w:right="115"/>
+      </w:pPr>
+      <w:r>
+        <w:t xml:space="preserve">FROM dated</w:t>
+      </w:r>
+    </w:p>
+    <w:p>
+      <w:pPr>
+        <w:pStyle w:val="SQLQueryBlock"/>
+        <w:pBdr>
+          <w:top w:val="single" w:sz="4" w:space="4" w:color="B7C1CC"/>
+          <w:left w:val="single" w:sz="4" w:space="4" w:color="B7C1CC"/>
+          <w:bottom w:val="single" w:sz="4" w:space="4" w:color="B7C1CC"/>
+          <w:right w:val="single" w:sz="4" w:space="4" w:color="B7C1CC"/>
+        </w:pBdr>
+        <w:shd w:val="clear" w:color="auto" w:fill="F3F5F7"/>
+        <w:spacing w:before="40" w:after="120"/>
+        <w:ind w:left="115" w:right="115"/>
+      </w:pPr>
+      <w:r>
+        <w:t xml:space="preserve">WHERE strftime('%w', TxDate) IN ('0', '6')</w:t>
+      </w:r>
+    </w:p>
+    <w:p>
+      <w:pPr>
+        <w:pStyle w:val="SQLQueryBlock"/>
+        <w:pBdr>
+          <w:top w:val="single" w:sz="4" w:space="4" w:color="B7C1CC"/>
+          <w:left w:val="single" w:sz="4" w:space="4" w:color="B7C1CC"/>
+          <w:bottom w:val="single" w:sz="4" w:space="4" w:color="B7C1CC"/>
+          <w:right w:val="single" w:sz="4" w:space="4" w:color="B7C1CC"/>
+        </w:pBdr>
+        <w:shd w:val="clear" w:color="auto" w:fill="F3F5F7"/>
+        <w:spacing w:before="40" w:after="120"/>
+        <w:ind w:left="115" w:right="115"/>
+      </w:pPr>
+      <w:r>
+        <w:t xml:space="preserve">ORDER BY TxDate ASC, FullName ASC;</w:t>
       </w:r>
     </w:p>
     <w:p>
@@ -9808,25 +9669,19 @@
         <w:ind w:left="115" w:right="115"/>
       </w:pPr>
       <w:r>
-        <w:t xml:space="preserve">The query </w:t>
-      </w:r>
-      <w:proofErr w:type="gramStart"/>
-      <w:r>
-        <w:t>returned</w:t>
-      </w:r>
-      <w:proofErr w:type="gramEnd"/>
-      <w:r>
-        <w:t xml:space="preserve"> </w:t>
+        <w:rPr/>
+        <w:t xml:space="preserve">The query returned </w:t>
       </w:r>
       <w:r>
         <w:rPr>
           <w:b/>
           <w:bCs/>
         </w:rPr>
-        <w:t>1,386 rows</w:t>
-      </w:r>
-      <w:r>
-        <w:t xml:space="preserve"> representing transactions executed on weekends (Saturdays and Sundays) during calendar year 2014.</w:t>
+        <w:t xml:space="preserve">9,718 weekend transactions</w:t>
+      </w:r>
+      <w:r>
+        <w:rPr/>
+        <w:t xml:space="preserve"> (8.4% of all 116,031 transactions in 2014) by 1,370 cardholders, totalling $2,166,531.09.</w:t>
       </w:r>
     </w:p>
     <w:p>
@@ -9851,10 +9706,11 @@
           <w:b/>
           <w:bCs/>
         </w:rPr>
-        <w:t>Example 1:</w:t>
-      </w:r>
-      <w:r>
-        <w:t xml:space="preserve"> Employee 7708928D spent $874.00 at VWR INTERNATIONAL INC for VWR FREEZER MANUAL DEFROST EA.</w:t>
+        <w:t xml:space="preserve">Largest:</w:t>
+      </w:r>
+      <w:r>
+        <w:rPr/>
+        <w:t xml:space="preserve"> Employee 302B04AF spent $10,299.66 at WATERFRONT PLACE HOTEL for ROOM CHARGES on Sunday, 4/13/2014.</w:t>
       </w:r>
     </w:p>
     <w:p>
@@ -9879,10 +9735,11 @@
           <w:b/>
           <w:bCs/>
         </w:rPr>
-        <w:t>Example 2:</w:t>
-      </w:r>
-      <w:r>
-        <w:t xml:space="preserve"> Employee 44BFDE40 spent $137.80 at CampaignMonitor.co for GENERAL PURCHASE.</w:t>
+        <w:t xml:space="preserve">Second Largest:</w:t>
+      </w:r>
+      <w:r>
+        <w:rPr/>
+        <w:t xml:space="preserve"> Employee 302B04AF spent $6,905.52 at SPRINGHILL SUITES TERRE for ROOM CHARGES on Saturday, 11/22/2014.</w:t>
       </w:r>
     </w:p>
     <w:p>
@@ -9907,10 +9764,11 @@
           <w:b/>
           <w:bCs/>
         </w:rPr>
-        <w:t>Example 3:</w:t>
-      </w:r>
-      <w:r>
-        <w:t xml:space="preserve"> Employee 77949E3B made multiple weekend purchases, including OUTBACK 3715 ($218.33), COURTYARD BY MARRIOTT ($7.70), DEI WEI #0191 ($59.56), and RUDY'S #211 ($32.83).</w:t>
+        <w:t xml:space="preserve">Most weekend activity:</w:t>
+      </w:r>
+      <w:r>
+        <w:rPr/>
+        <w:t xml:space="preserve"> Employee 8A27F2BB (184 transactions), Employee 50D6FB87 (169) and Employee 51914657 (161). Hotel charges during travel are expected on weekends, so follow-up should focus on non-travel purchases by these frequent weekend users.</w:t>
       </w:r>
     </w:p>
     <w:p>
@@ -9927,7 +9785,7 @@
       </w:r>
       <w:proofErr w:type="gramEnd"/>
       <w:r>
-        <w:t xml:space="preserve">  Student-defined internal-control test</w:t>
+        <w:t xml:space="preserve">  Personal memberships and dues may not be paid with a P-card.</w:t>
       </w:r>
     </w:p>
     <w:p>
@@ -9943,7 +9801,7 @@
         <w:pStyle w:val="ControlFieldText"/>
       </w:pPr>
       <w:r>
-        <w:t>Define the student's additional internal-control question 7. State the control requirement or risk, explain the test to perform using 2014 data, and specify the fields and sorting required in the output.</w:t>
+        <w:t xml:space="preserve">Paying personal memberships and dues violates state statutes. Display the name, amount, vendor, description and transaction date for all 2014 transactions whose description mentions "membership" or "dues". Sort by amount, largest first.</w:t>
       </w:r>
     </w:p>
     <w:p>
@@ -10062,6 +9920,7 @@
         <w:ind w:left="115" w:right="115"/>
       </w:pPr>
       <w:r>
+        <w:rPr/>
         <w:t xml:space="preserve">The query returned </w:t>
       </w:r>
       <w:r>
@@ -10069,10 +9928,11 @@
           <w:b/>
           <w:bCs/>
         </w:rPr>
-        <w:t>11 rows</w:t>
-      </w:r>
-      <w:r>
-        <w:t xml:space="preserve"> representing potentially prohibited membership dues or professional organization fee transactions in calendar year 2014.</w:t>
+        <w:t xml:space="preserve">11 transactions</w:t>
+      </w:r>
+      <w:r>
+        <w:rPr/>
+        <w:t xml:space="preserve"> for membership dues or professional organization fees in calendar year 2014. Institutional memberships are allowed, so each one needs to be checked to see whether it is in the employee's own name.</w:t>
       </w:r>
     </w:p>
     <w:p>
@@ -10097,10 +9957,11 @@
           <w:b/>
           <w:bCs/>
         </w:rPr>
-        <w:t>Top Violation:</w:t>
-      </w:r>
-      <w:r>
-        <w:t xml:space="preserve"> Employee 5B3C0D55 spent $1,960.00 at SOCIETY FOR COLLEGE AND U for Membership Payment EA.</w:t>
+        <w:t xml:space="preserve">Top Violation:</w:t>
+      </w:r>
+      <w:r>
+        <w:rPr/>
+        <w:t xml:space="preserve"> Employee 503C0D55 spent $1,960.00 at SOCIETY FOR COLLEGE AND U for Membership Payment EA.</w:t>
       </w:r>
     </w:p>
     <w:p>
@@ -10125,9 +9986,10 @@
           <w:b/>
           <w:bCs/>
         </w:rPr>
-        <w:t>Second Highest Violation:</w:t>
-      </w:r>
-      <w:r>
+        <w:t xml:space="preserve">Second Highest Violation:</w:t>
+      </w:r>
+      <w:r>
+        <w:rPr/>
         <w:t xml:space="preserve"> Employee F5B52088 spent $1,152.00 at THE COMPUTING RESEARCH for MEMBERSHIP OR CONFERENCE O EA.</w:t>
       </w:r>
     </w:p>
@@ -10153,10 +10015,11 @@
           <w:b/>
           <w:bCs/>
         </w:rPr>
-        <w:t>Third Highest Violation:</w:t>
-      </w:r>
-      <w:r>
-        <w:t xml:space="preserve"> Employee 688B3D92 spent $430.00 at NFPA NATL FIRE PROTECT for Membership Dues NMB.</w:t>
+        <w:t xml:space="preserve">Third Highest Violation:</w:t>
+      </w:r>
+      <w:r>
+        <w:rPr/>
+        <w:t xml:space="preserve"> Employee C786CB5E spent $494.57 at NFPA NATL FIRE PROTECT for NEC handbooks and Membership Dues.</w:t>
       </w:r>
     </w:p>
     <w:p>
@@ -10181,10 +10044,11 @@
           <w:b/>
           <w:bCs/>
         </w:rPr>
-        <w:t>Other Notable Examples:</w:t>
-      </w:r>
-      <w:r>
-        <w:t xml:space="preserve"> Employee 22ECF30A ($325.00 at COLLEGEBOARD PRODUCTS for College Board Membership F EA) and Employee E1AF5FED ($200.00 at ASSOCIATION OF FAMILY PRA for Membership Payment EA).</w:t>
+        <w:t xml:space="preserve">Other Notable Examples:</w:t>
+      </w:r>
+      <w:r>
+        <w:rPr/>
+        <w:t xml:space="preserve"> Employee 688E3D92 ($430.00 at NFPA NATL FIRE PROTECT for Membership Dues NMB), Employee 22ECF33A ($325.00 at COLLEGEBOARD PRODUCTS) and Employee E1AF5FBD ($200.00 at ASSOCIATION OF FAMILY PRA).</w:t>
       </w:r>
     </w:p>
     <w:p>
@@ -12008,7 +11872,436 @@
           </w:p>
         </w:tc>
       </w:tr>
+      <w:tr>
+        <w:trPr>
+          <w:tblCellSpacing w:w="15" w:type="dxa"/>
+        </w:trPr>
+        <w:tc>
+          <w:tcPr>
+            <w:tcW w:w="0" w:type="auto"/>
+            <w:tcBorders>
+              <w:top w:val="single" w:sz="6" w:space="0" w:color="C4C7C5"/>
+              <w:left w:val="single" w:sz="6" w:space="0" w:color="C4C7C5"/>
+              <w:bottom w:val="single" w:sz="6" w:space="0" w:color="C4C7C5"/>
+              <w:right w:val="single" w:sz="6" w:space="0" w:color="C4C7C5"/>
+            </w:tcBorders>
+            <w:tcMar>
+              <w:top w:w="120" w:type="dxa"/>
+              <w:left w:w="180" w:type="dxa"/>
+              <w:bottom w:w="120" w:type="dxa"/>
+              <w:right w:w="180" w:type="dxa"/>
+            </w:tcMar>
+            <w:vAlign w:val="center"/>
+            <w:hideMark/>
+          </w:tcPr>
+          <w:p>
+            <w:pPr>
+              <w:spacing w:after="0" w:line="240" w:lineRule="auto"/>
+              <w:rPr>
+                <w:rFonts w:ascii="Arial" w:eastAsia="Times New Roman" w:hAnsi="Arial" w:cs="Arial"/>
+                <w:color w:val="1F1F1F"/>
+                <w:sz w:val="24"/>
+                <w:szCs w:val="24"/>
+              </w:rPr>
+            </w:pPr>
+            <w:r>
+              <w:rPr>
+                <w:rFonts w:ascii="Arial" w:eastAsia="Times New Roman" w:hAnsi="Arial" w:cs="Arial"/>
+                <w:b/>
+                <w:bCs/>
+                <w:color w:val="1F1F1F"/>
+                <w:sz w:val="24"/>
+                <w:szCs w:val="24"/>
+                <w:bdr w:val="none" w:sz="0" w:space="0" w:color="auto" w:frame="1"/>
+              </w:rPr>
+              <w:t>8</w:t>
+            </w:r>
+          </w:p>
+        </w:tc>
+        <w:tc>
+          <w:tcPr>
+            <w:tcW w:w="0" w:type="auto"/>
+            <w:tcBorders>
+              <w:top w:val="single" w:sz="6" w:space="0" w:color="C4C7C5"/>
+              <w:left w:val="single" w:sz="6" w:space="0" w:color="C4C7C5"/>
+              <w:bottom w:val="single" w:sz="6" w:space="0" w:color="C4C7C5"/>
+              <w:right w:val="single" w:sz="6" w:space="0" w:color="C4C7C5"/>
+            </w:tcBorders>
+            <w:tcMar>
+              <w:top w:w="120" w:type="dxa"/>
+              <w:left w:w="180" w:type="dxa"/>
+              <w:bottom w:w="120" w:type="dxa"/>
+              <w:right w:w="180" w:type="dxa"/>
+            </w:tcMar>
+            <w:vAlign w:val="center"/>
+            <w:hideMark/>
+          </w:tcPr>
+          <w:p>
+            <w:pPr>
+              <w:spacing w:after="0" w:line="240" w:lineRule="auto"/>
+              <w:rPr>
+                <w:rFonts w:ascii="Arial" w:eastAsia="Times New Roman" w:hAnsi="Arial" w:cs="Arial"/>
+                <w:color w:val="1F1F1F"/>
+                <w:sz w:val="24"/>
+                <w:szCs w:val="24"/>
+              </w:rPr>
+            </w:pPr>
+            <w:r>
+              <w:rPr>
+                <w:rFonts w:ascii="Arial" w:eastAsia="Times New Roman" w:hAnsi="Arial" w:cs="Arial"/>
+                <w:color w:val="1F1F1F"/>
+                <w:sz w:val="24"/>
+                <w:szCs w:val="24"/>
+                <w:bdr w:val="none" w:sz="0" w:space="0" w:color="auto" w:frame="1"/>
+              </w:rPr>
+              <w:t>6,024</w:t>
+            </w:r>
+          </w:p>
+        </w:tc>
+        <w:tc>
+          <w:tcPr>
+            <w:tcW w:w="0" w:type="auto"/>
+            <w:tcBorders>
+              <w:top w:val="single" w:sz="6" w:space="0" w:color="C4C7C5"/>
+              <w:left w:val="single" w:sz="6" w:space="0" w:color="C4C7C5"/>
+              <w:bottom w:val="single" w:sz="6" w:space="0" w:color="C4C7C5"/>
+              <w:right w:val="single" w:sz="6" w:space="0" w:color="C4C7C5"/>
+            </w:tcBorders>
+            <w:tcMar>
+              <w:top w:w="120" w:type="dxa"/>
+              <w:left w:w="180" w:type="dxa"/>
+              <w:bottom w:w="120" w:type="dxa"/>
+              <w:right w:w="180" w:type="dxa"/>
+            </w:tcMar>
+            <w:vAlign w:val="center"/>
+            <w:hideMark/>
+          </w:tcPr>
+          <w:p>
+            <w:pPr>
+              <w:spacing w:after="0" w:line="240" w:lineRule="auto"/>
+              <w:rPr>
+                <w:rFonts w:ascii="Arial" w:eastAsia="Times New Roman" w:hAnsi="Arial" w:cs="Arial"/>
+                <w:color w:val="1F1F1F"/>
+                <w:sz w:val="24"/>
+                <w:szCs w:val="24"/>
+              </w:rPr>
+            </w:pPr>
+            <w:r>
+              <w:rPr>
+                <w:rFonts w:ascii="Arial" w:eastAsia="Times New Roman" w:hAnsi="Arial" w:cs="Arial"/>
+                <w:color w:val="1F1F1F"/>
+                <w:sz w:val="24"/>
+                <w:szCs w:val="24"/>
+                <w:bdr w:val="none" w:sz="0" w:space="0" w:color="auto" w:frame="1"/>
+              </w:rPr>
+              <w:t>5.372%</w:t>
+            </w:r>
+          </w:p>
+        </w:tc>
+        <w:tc>
+          <w:tcPr>
+            <w:tcW w:w="0" w:type="auto"/>
+            <w:tcBorders>
+              <w:top w:val="single" w:sz="6" w:space="0" w:color="C4C7C5"/>
+              <w:left w:val="single" w:sz="6" w:space="0" w:color="C4C7C5"/>
+              <w:bottom w:val="single" w:sz="6" w:space="0" w:color="C4C7C5"/>
+              <w:right w:val="single" w:sz="6" w:space="0" w:color="C4C7C5"/>
+            </w:tcBorders>
+            <w:tcMar>
+              <w:top w:w="120" w:type="dxa"/>
+              <w:left w:w="180" w:type="dxa"/>
+              <w:bottom w:w="120" w:type="dxa"/>
+              <w:right w:w="180" w:type="dxa"/>
+            </w:tcMar>
+            <w:vAlign w:val="center"/>
+            <w:hideMark/>
+          </w:tcPr>
+          <w:p>
+            <w:pPr>
+              <w:spacing w:after="0" w:line="240" w:lineRule="auto"/>
+              <w:rPr>
+                <w:rFonts w:ascii="Arial" w:eastAsia="Times New Roman" w:hAnsi="Arial" w:cs="Arial"/>
+                <w:color w:val="1F1F1F"/>
+                <w:sz w:val="24"/>
+                <w:szCs w:val="24"/>
+              </w:rPr>
+            </w:pPr>
+            <w:r>
+              <w:rPr>
+                <w:rFonts w:ascii="Arial" w:eastAsia="Times New Roman" w:hAnsi="Arial" w:cs="Arial"/>
+                <w:color w:val="1F1F1F"/>
+                <w:sz w:val="24"/>
+                <w:szCs w:val="24"/>
+                <w:bdr w:val="none" w:sz="0" w:space="0" w:color="auto" w:frame="1"/>
+              </w:rPr>
+              <w:t>5.1%</w:t>
+            </w:r>
+          </w:p>
+        </w:tc>
+      </w:tr>
+      <w:tr>
+        <w:trPr>
+          <w:tblCellSpacing w:w="15" w:type="dxa"/>
+        </w:trPr>
+        <w:tc>
+          <w:tcPr>
+            <w:tcW w:w="0" w:type="auto"/>
+            <w:tcBorders>
+              <w:top w:val="single" w:sz="6" w:space="0" w:color="C4C7C5"/>
+              <w:left w:val="single" w:sz="6" w:space="0" w:color="C4C7C5"/>
+              <w:bottom w:val="single" w:sz="6" w:space="0" w:color="C4C7C5"/>
+              <w:right w:val="single" w:sz="6" w:space="0" w:color="C4C7C5"/>
+            </w:tcBorders>
+            <w:tcMar>
+              <w:top w:w="120" w:type="dxa"/>
+              <w:left w:w="180" w:type="dxa"/>
+              <w:bottom w:w="120" w:type="dxa"/>
+              <w:right w:w="180" w:type="dxa"/>
+            </w:tcMar>
+            <w:vAlign w:val="center"/>
+            <w:hideMark/>
+          </w:tcPr>
+          <w:p>
+            <w:pPr>
+              <w:spacing w:after="0" w:line="240" w:lineRule="auto"/>
+              <w:rPr>
+                <w:rFonts w:ascii="Arial" w:eastAsia="Times New Roman" w:hAnsi="Arial" w:cs="Arial"/>
+                <w:color w:val="1F1F1F"/>
+                <w:sz w:val="24"/>
+                <w:szCs w:val="24"/>
+              </w:rPr>
+            </w:pPr>
+            <w:r>
+              <w:rPr>
+                <w:rFonts w:ascii="Arial" w:eastAsia="Times New Roman" w:hAnsi="Arial" w:cs="Arial"/>
+                <w:b/>
+                <w:bCs/>
+                <w:color w:val="1F1F1F"/>
+                <w:sz w:val="24"/>
+                <w:szCs w:val="24"/>
+                <w:bdr w:val="none" w:sz="0" w:space="0" w:color="auto" w:frame="1"/>
+              </w:rPr>
+              <w:t>9</w:t>
+            </w:r>
+          </w:p>
+        </w:tc>
+        <w:tc>
+          <w:tcPr>
+            <w:tcW w:w="0" w:type="auto"/>
+            <w:tcBorders>
+              <w:top w:val="single" w:sz="6" w:space="0" w:color="C4C7C5"/>
+              <w:left w:val="single" w:sz="6" w:space="0" w:color="C4C7C5"/>
+              <w:bottom w:val="single" w:sz="6" w:space="0" w:color="C4C7C5"/>
+              <w:right w:val="single" w:sz="6" w:space="0" w:color="C4C7C5"/>
+            </w:tcBorders>
+            <w:tcMar>
+              <w:top w:w="120" w:type="dxa"/>
+              <w:left w:w="180" w:type="dxa"/>
+              <w:bottom w:w="120" w:type="dxa"/>
+              <w:right w:w="180" w:type="dxa"/>
+            </w:tcMar>
+            <w:vAlign w:val="center"/>
+            <w:hideMark/>
+          </w:tcPr>
+          <w:p>
+            <w:pPr>
+              <w:spacing w:after="0" w:line="240" w:lineRule="auto"/>
+              <w:rPr>
+                <w:rFonts w:ascii="Arial" w:eastAsia="Times New Roman" w:hAnsi="Arial" w:cs="Arial"/>
+                <w:color w:val="1F1F1F"/>
+                <w:sz w:val="24"/>
+                <w:szCs w:val="24"/>
+              </w:rPr>
+            </w:pPr>
+            <w:r>
+              <w:rPr>
+                <w:rFonts w:ascii="Arial" w:eastAsia="Times New Roman" w:hAnsi="Arial" w:cs="Arial"/>
+                <w:color w:val="1F1F1F"/>
+                <w:sz w:val="24"/>
+                <w:szCs w:val="24"/>
+                <w:bdr w:val="none" w:sz="0" w:space="0" w:color="auto" w:frame="1"/>
+              </w:rPr>
+              <w:t>5,372</w:t>
+            </w:r>
+          </w:p>
+        </w:tc>
+        <w:tc>
+          <w:tcPr>
+            <w:tcW w:w="0" w:type="auto"/>
+            <w:tcBorders>
+              <w:top w:val="single" w:sz="6" w:space="0" w:color="C4C7C5"/>
+              <w:left w:val="single" w:sz="6" w:space="0" w:color="C4C7C5"/>
+              <w:bottom w:val="single" w:sz="6" w:space="0" w:color="C4C7C5"/>
+              <w:right w:val="single" w:sz="6" w:space="0" w:color="C4C7C5"/>
+            </w:tcBorders>
+            <w:tcMar>
+              <w:top w:w="120" w:type="dxa"/>
+              <w:left w:w="180" w:type="dxa"/>
+              <w:bottom w:w="120" w:type="dxa"/>
+              <w:right w:w="180" w:type="dxa"/>
+            </w:tcMar>
+            <w:vAlign w:val="center"/>
+            <w:hideMark/>
+          </w:tcPr>
+          <w:p>
+            <w:pPr>
+              <w:spacing w:after="0" w:line="240" w:lineRule="auto"/>
+              <w:rPr>
+                <w:rFonts w:ascii="Arial" w:eastAsia="Times New Roman" w:hAnsi="Arial" w:cs="Arial"/>
+                <w:color w:val="1F1F1F"/>
+                <w:sz w:val="24"/>
+                <w:szCs w:val="24"/>
+              </w:rPr>
+            </w:pPr>
+            <w:r>
+              <w:rPr>
+                <w:rFonts w:ascii="Arial" w:eastAsia="Times New Roman" w:hAnsi="Arial" w:cs="Arial"/>
+                <w:color w:val="1F1F1F"/>
+                <w:sz w:val="24"/>
+                <w:szCs w:val="24"/>
+                <w:bdr w:val="none" w:sz="0" w:space="0" w:color="auto" w:frame="1"/>
+              </w:rPr>
+              <w:t>4.790%</w:t>
+            </w:r>
+          </w:p>
+        </w:tc>
+        <w:tc>
+          <w:tcPr>
+            <w:tcW w:w="0" w:type="auto"/>
+            <w:tcBorders>
+              <w:top w:val="single" w:sz="6" w:space="0" w:color="C4C7C5"/>
+              <w:left w:val="single" w:sz="6" w:space="0" w:color="C4C7C5"/>
+              <w:bottom w:val="single" w:sz="6" w:space="0" w:color="C4C7C5"/>
+              <w:right w:val="single" w:sz="6" w:space="0" w:color="C4C7C5"/>
+            </w:tcBorders>
+            <w:tcMar>
+              <w:top w:w="120" w:type="dxa"/>
+              <w:left w:w="180" w:type="dxa"/>
+              <w:bottom w:w="120" w:type="dxa"/>
+              <w:right w:w="180" w:type="dxa"/>
+            </w:tcMar>
+            <w:vAlign w:val="center"/>
+            <w:hideMark/>
+          </w:tcPr>
+          <w:p>
+            <w:pPr>
+              <w:spacing w:after="0" w:line="240" w:lineRule="auto"/>
+              <w:rPr>
+                <w:rFonts w:ascii="Arial" w:eastAsia="Times New Roman" w:hAnsi="Arial" w:cs="Arial"/>
+                <w:color w:val="1F1F1F"/>
+                <w:sz w:val="24"/>
+                <w:szCs w:val="24"/>
+              </w:rPr>
+            </w:pPr>
+            <w:r>
+              <w:rPr>
+                <w:rFonts w:ascii="Arial" w:eastAsia="Times New Roman" w:hAnsi="Arial" w:cs="Arial"/>
+                <w:color w:val="1F1F1F"/>
+                <w:sz w:val="24"/>
+                <w:szCs w:val="24"/>
+                <w:bdr w:val="none" w:sz="0" w:space="0" w:color="auto" w:frame="1"/>
+              </w:rPr>
+              <w:t>4.6%</w:t>
+            </w:r>
+          </w:p>
+        </w:tc>
+      </w:tr>
     </w:tbl>
+    <w:p>
+      <w:pPr>
+        <w:pStyle w:val="ResultPlaceholder"/>
+        <w:pBdr>
+          <w:top w:val="single" w:sz="4" w:space="4" w:color="C9D1D9"/>
+          <w:left w:val="single" w:sz="4" w:space="4" w:color="C9D1D9"/>
+          <w:bottom w:val="single" w:sz="4" w:space="4" w:color="C9D1D9"/>
+          <w:right w:val="single" w:sz="4" w:space="4" w:color="C9D1D9"/>
+        </w:pBdr>
+        <w:shd w:val="clear" w:color="auto" w:fill="FFFFFF"/>
+        <w:ind w:left="115" w:right="115"/>
+      </w:pPr>
+      <w:r>
+        <w:rPr/>
+        <w:t xml:space="preserve">The first-digit distribution follows Benford's Law closely. The mean absolute deviation (MAD) between the actual and expected percentages is </w:t>
+      </w:r>
+      <w:r>
+        <w:rPr>
+          <w:b/>
+          <w:bCs/>
+        </w:rPr>
+        <w:t xml:space="preserve">0.0032</w:t>
+      </w:r>
+      <w:r>
+        <w:rPr/>
+        <w:t xml:space="preserve">, which is within Nigrini's "close conformity" range for first digits (below 0.006).</w:t>
+      </w:r>
+    </w:p>
+    <w:p>
+      <w:pPr>
+        <w:pStyle w:val="ResultPlaceholder"/>
+        <w:numPr>
+          <w:ilvl w:val="0"/>
+          <w:numId w:val="15"/>
+        </w:numPr>
+        <w:pBdr>
+          <w:top w:val="single" w:sz="4" w:space="4" w:color="C9D1D9"/>
+          <w:left w:val="single" w:sz="4" w:space="4" w:color="C9D1D9"/>
+          <w:bottom w:val="single" w:sz="4" w:space="4" w:color="C9D1D9"/>
+          <w:right w:val="single" w:sz="4" w:space="4" w:color="C9D1D9"/>
+        </w:pBdr>
+        <w:shd w:val="clear" w:color="auto" w:fill="FFFFFF"/>
+        <w:ind w:right="115"/>
+      </w:pPr>
+      <w:r>
+        <w:rPr>
+          <w:b/>
+          <w:bCs/>
+        </w:rPr>
+        <w:t xml:space="preserve">Largest deviations:</w:t>
+      </w:r>
+      <w:r>
+        <w:rPr/>
+        <w:t xml:space="preserve"> digit 1 is slightly under-represented (29.5% vs 30.1%) and digits 5, 8 and 9 slightly over-represented (8.2% vs 7.9%, 5.4% vs 5.1%, 4.8% vs 4.6%), which is consistent with purchases kept just under the round $5,000 limit (see Control 11 and Question 8).</w:t>
+      </w:r>
+    </w:p>
+    <w:p>
+      <w:pPr>
+        <w:pStyle w:val="ResultPlaceholder"/>
+        <w:numPr>
+          <w:ilvl w:val="0"/>
+          <w:numId w:val="15"/>
+        </w:numPr>
+        <w:pBdr>
+          <w:top w:val="single" w:sz="4" w:space="4" w:color="C9D1D9"/>
+          <w:left w:val="single" w:sz="4" w:space="4" w:color="C9D1D9"/>
+          <w:bottom w:val="single" w:sz="4" w:space="4" w:color="C9D1D9"/>
+          <w:right w:val="single" w:sz="4" w:space="4" w:color="C9D1D9"/>
+        </w:pBdr>
+        <w:shd w:val="clear" w:color="auto" w:fill="FFFFFF"/>
+        <w:ind w:right="115"/>
+      </w:pPr>
+      <w:r>
+        <w:rPr>
+          <w:b/>
+          <w:bCs/>
+        </w:rPr>
+        <w:t xml:space="preserve">Conclusion:</w:t>
+      </w:r>
+      <w:r>
+        <w:rPr/>
+        <w:t xml:space="preserve"> the population as a whole indicates a </w:t>
+      </w:r>
+      <w:r>
+        <w:rPr>
+          <w:b/>
+          <w:bCs/>
+        </w:rPr>
+        <w:t xml:space="preserve">relatively low fraud risk</w:t>
+      </w:r>
+      <w:r>
+        <w:rPr/>
+        <w:t xml:space="preserve">. Benford's analysis cannot find individual fraudulent transactions, so the targeted tests below are still needed.</w:t>
+      </w:r>
+    </w:p>
     <w:p>
       <w:pPr>
         <w:pStyle w:val="ControlBlockTitle"/>
@@ -12097,23 +12390,7 @@
         <w:ind w:left="115" w:right="115"/>
       </w:pPr>
       <w:r>
-        <w:t xml:space="preserve">SELECT </w:t>
-      </w:r>
-      <w:proofErr w:type="spellStart"/>
-      <w:r>
-        <w:t>TransactionDate</w:t>
-      </w:r>
-      <w:proofErr w:type="spellEnd"/>
-      <w:r>
-        <w:t xml:space="preserve">, Vendor, </w:t>
-      </w:r>
-      <w:proofErr w:type="spellStart"/>
-      <w:r>
-        <w:t>FullName</w:t>
-      </w:r>
-      <w:proofErr w:type="spellEnd"/>
-      <w:r>
-        <w:t>, Amount</w:t>
+        <w:t xml:space="preserve">SELECT TransactionDate, Vendor, FullName, Amount</w:t>
       </w:r>
     </w:p>
     <w:p>
@@ -12130,13 +12407,8 @@
         <w:ind w:left="115" w:right="115"/>
       </w:pPr>
       <w:r>
-        <w:t xml:space="preserve">FROM </w:t>
-      </w:r>
-      <w:proofErr w:type="spellStart"/>
-      <w:r>
-        <w:t>pcards</w:t>
-      </w:r>
-      <w:proofErr w:type="spellEnd"/>
+        <w:t xml:space="preserve">FROM pcards</w:t>
+      </w:r>
     </w:p>
     <w:p>
       <w:pPr>
@@ -12152,7 +12424,7 @@
         <w:ind w:left="115" w:right="115"/>
       </w:pPr>
       <w:r>
-        <w:t xml:space="preserve">WHERE Year = 2014 </w:t>
+        <w:t xml:space="preserve">WHERE Year = 2014</w:t>
       </w:r>
     </w:p>
     <w:p>
@@ -12186,23 +12458,7 @@
         <w:ind w:left="115" w:right="115"/>
       </w:pPr>
       <w:r>
-        <w:t xml:space="preserve">  AND (</w:t>
-      </w:r>
-      <w:proofErr w:type="spellStart"/>
-      <w:r>
-        <w:t>TransactionDate</w:t>
-      </w:r>
-      <w:proofErr w:type="spellEnd"/>
-      <w:r>
-        <w:t xml:space="preserve">, Vendor, Amount, </w:t>
-      </w:r>
-      <w:proofErr w:type="spellStart"/>
-      <w:r>
-        <w:t>FullName</w:t>
-      </w:r>
-      <w:proofErr w:type="spellEnd"/>
-      <w:r>
-        <w:t>) IN (</w:t>
+        <w:t xml:space="preserve">  AND (TransactionDate, Vendor, CardholderFirstInitial, CardholderLastName, Amount) IN (</w:t>
       </w:r>
     </w:p>
     <w:p>
@@ -12219,21 +12475,8 @@
         <w:ind w:left="115" w:right="115"/>
       </w:pPr>
       <w:r>
-        <w:t xml:space="preserve">      SELECT </w:t>
-      </w:r>
-      <w:proofErr w:type="spellStart"/>
-      <w:r>
-        <w:t>TransactionDate</w:t>
-      </w:r>
-      <w:proofErr w:type="spellEnd"/>
-      <w:r>
-        <w:t xml:space="preserve">, Vendor, Amount, </w:t>
-      </w:r>
-      <w:proofErr w:type="spellStart"/>
-      <w:r>
-        <w:t>FullName</w:t>
-      </w:r>
-      <w:proofErr w:type="spellEnd"/>
+        <w:t xml:space="preserve">      SELECT TransactionDate, Vendor, CardholderFirstInitial, CardholderLastName, Amount</w:t>
+      </w:r>
     </w:p>
     <w:p>
       <w:pPr>
@@ -12249,13 +12492,8 @@
         <w:ind w:left="115" w:right="115"/>
       </w:pPr>
       <w:r>
-        <w:t xml:space="preserve">      FROM </w:t>
-      </w:r>
-      <w:proofErr w:type="spellStart"/>
-      <w:r>
-        <w:t>pcards</w:t>
-      </w:r>
-      <w:proofErr w:type="spellEnd"/>
+        <w:t xml:space="preserve">      FROM pcards</w:t>
+      </w:r>
     </w:p>
     <w:p>
       <w:pPr>
@@ -12288,21 +12526,8 @@
         <w:ind w:left="115" w:right="115"/>
       </w:pPr>
       <w:r>
-        <w:t xml:space="preserve">      GROUP BY </w:t>
-      </w:r>
-      <w:proofErr w:type="spellStart"/>
-      <w:r>
-        <w:t>TransactionDate</w:t>
-      </w:r>
-      <w:proofErr w:type="spellEnd"/>
-      <w:r>
-        <w:t xml:space="preserve">, Vendor, Amount, </w:t>
-      </w:r>
-      <w:proofErr w:type="spellStart"/>
-      <w:r>
-        <w:t>FullName</w:t>
-      </w:r>
-      <w:proofErr w:type="spellEnd"/>
+        <w:t xml:space="preserve">      GROUP BY TransactionDate, Vendor, CardholderFirstInitial, CardholderLastName, Amount</w:t>
+      </w:r>
     </w:p>
     <w:p>
       <w:pPr>
@@ -12318,15 +12543,7 @@
         <w:ind w:left="115" w:right="115"/>
       </w:pPr>
       <w:r>
-        <w:t xml:space="preserve">      HAVING </w:t>
-      </w:r>
-      <w:proofErr w:type="gramStart"/>
-      <w:r>
-        <w:t>COUNT(</w:t>
-      </w:r>
-      <w:proofErr w:type="gramEnd"/>
-      <w:r>
-        <w:t>*) &gt; 1</w:t>
+        <w:t xml:space="preserve">      HAVING COUNT(*) &gt; 1</w:t>
       </w:r>
     </w:p>
     <w:p>
@@ -12360,15 +12577,7 @@
         <w:ind w:left="115" w:right="115"/>
       </w:pPr>
       <w:r>
-        <w:t xml:space="preserve">ORDER BY </w:t>
-      </w:r>
-      <w:proofErr w:type="spellStart"/>
-      <w:r>
-        <w:t>TransactionDate</w:t>
-      </w:r>
-      <w:proofErr w:type="spellEnd"/>
-      <w:r>
-        <w:t xml:space="preserve"> ASC, Vendor ASC;</w:t>
+        <w:t xml:space="preserve">ORDER BY TransactionDate ASC, Vendor ASC;</w:t>
       </w:r>
     </w:p>
     <w:p>
@@ -12393,25 +12602,19 @@
         <w:ind w:left="115" w:right="115"/>
       </w:pPr>
       <w:r>
-        <w:t xml:space="preserve">The query </w:t>
-      </w:r>
-      <w:proofErr w:type="gramStart"/>
-      <w:r>
-        <w:t>returned</w:t>
-      </w:r>
-      <w:proofErr w:type="gramEnd"/>
-      <w:r>
-        <w:t xml:space="preserve"> </w:t>
+        <w:rPr/>
+        <w:t xml:space="preserve">The query returned </w:t>
       </w:r>
       <w:r>
         <w:rPr>
           <w:b/>
           <w:bCs/>
         </w:rPr>
-        <w:t>4,924 rows</w:t>
-      </w:r>
-      <w:r>
-        <w:t xml:space="preserve"> representing positive charge transactions that share identical transaction dates, vendors, cardholder names, and dollar amounts during calendar year 2014.</w:t>
+        <w:t xml:space="preserve">4,924 rows</w:t>
+      </w:r>
+      <w:r>
+        <w:rPr/>
+        <w:t xml:space="preserve"> representing positive charges that share the same transaction date, vendor, cardholder first initial, cardholder last name and amount during calendar year 2014.</w:t>
       </w:r>
     </w:p>
     <w:p>
@@ -12535,7 +12738,7 @@
         <w:ind w:left="115" w:right="115"/>
       </w:pPr>
       <w:r>
-        <w:t xml:space="preserve">SELECT </w:t>
+        <w:t xml:space="preserve">SELECT</w:t>
       </w:r>
     </w:p>
     <w:p>
@@ -12552,17 +12755,7 @@
         <w:ind w:left="115" w:right="115"/>
       </w:pPr>
       <w:r>
-        <w:t xml:space="preserve">    </w:t>
-      </w:r>
-      <w:proofErr w:type="spellStart"/>
-      <w:proofErr w:type="gramStart"/>
-      <w:r>
-        <w:t>FullName</w:t>
-      </w:r>
-      <w:proofErr w:type="spellEnd"/>
-      <w:proofErr w:type="gramEnd"/>
-      <w:r>
-        <w:t xml:space="preserve">, </w:t>
+        <w:t xml:space="preserve">    FullName,</w:t>
       </w:r>
     </w:p>
     <w:p>
@@ -12579,21 +12772,8 @@
         <w:ind w:left="115" w:right="115"/>
       </w:pPr>
       <w:r>
-        <w:t xml:space="preserve">    </w:t>
-      </w:r>
-      <w:proofErr w:type="gramStart"/>
-      <w:r>
-        <w:t>COUNT(</w:t>
-      </w:r>
-      <w:proofErr w:type="gramEnd"/>
-      <w:r>
-        <w:t xml:space="preserve">*) AS </w:t>
-      </w:r>
-      <w:proofErr w:type="spellStart"/>
-      <w:r>
-        <w:t>Duplicate_Occasions</w:t>
-      </w:r>
-      <w:proofErr w:type="spellEnd"/>
+        <w:t xml:space="preserve">    COUNT(*) AS Duplicate_Occasions</w:t>
+      </w:r>
     </w:p>
     <w:p>
       <w:pPr>
@@ -12609,7 +12789,7 @@
         <w:ind w:left="115" w:right="115"/>
       </w:pPr>
       <w:r>
-        <w:t>FROM (</w:t>
+        <w:t xml:space="preserve">FROM (</w:t>
       </w:r>
     </w:p>
     <w:p>
@@ -12626,23 +12806,7 @@
         <w:ind w:left="115" w:right="115"/>
       </w:pPr>
       <w:r>
-        <w:t xml:space="preserve">    SELECT </w:t>
-      </w:r>
-      <w:proofErr w:type="spellStart"/>
-      <w:r>
-        <w:t>FullName</w:t>
-      </w:r>
-      <w:proofErr w:type="spellEnd"/>
-      <w:r>
-        <w:t xml:space="preserve">, </w:t>
-      </w:r>
-      <w:proofErr w:type="spellStart"/>
-      <w:r>
-        <w:t>TransactionDate</w:t>
-      </w:r>
-      <w:proofErr w:type="spellEnd"/>
-      <w:r>
-        <w:t>, Vendor, Amount</w:t>
+        <w:t xml:space="preserve">    SELECT FullName, TransactionDate, Vendor, Amount</w:t>
       </w:r>
     </w:p>
     <w:p>
@@ -12659,13 +12823,8 @@
         <w:ind w:left="115" w:right="115"/>
       </w:pPr>
       <w:r>
-        <w:t xml:space="preserve">    FROM </w:t>
-      </w:r>
-      <w:proofErr w:type="spellStart"/>
-      <w:r>
-        <w:t>pcards</w:t>
-      </w:r>
-      <w:proofErr w:type="spellEnd"/>
+        <w:t xml:space="preserve">    FROM pcards</w:t>
+      </w:r>
     </w:p>
     <w:p>
       <w:pPr>
@@ -12698,23 +12857,7 @@
         <w:ind w:left="115" w:right="115"/>
       </w:pPr>
       <w:r>
-        <w:t xml:space="preserve">    GROUP BY </w:t>
-      </w:r>
-      <w:proofErr w:type="spellStart"/>
-      <w:r>
-        <w:t>FullName</w:t>
-      </w:r>
-      <w:proofErr w:type="spellEnd"/>
-      <w:r>
-        <w:t xml:space="preserve">, </w:t>
-      </w:r>
-      <w:proofErr w:type="spellStart"/>
-      <w:r>
-        <w:t>TransactionDate</w:t>
-      </w:r>
-      <w:proofErr w:type="spellEnd"/>
-      <w:r>
-        <w:t>, Vendor, Amount</w:t>
+        <w:t xml:space="preserve">    GROUP BY FullName, CardholderFirstInitial, CardholderLastName, TransactionDate, Vendor, Amount</w:t>
       </w:r>
     </w:p>
     <w:p>
@@ -12731,15 +12874,7 @@
         <w:ind w:left="115" w:right="115"/>
       </w:pPr>
       <w:r>
-        <w:t xml:space="preserve">    HAVING </w:t>
-      </w:r>
-      <w:proofErr w:type="gramStart"/>
-      <w:r>
-        <w:t>COUNT(</w:t>
-      </w:r>
-      <w:proofErr w:type="gramEnd"/>
-      <w:r>
-        <w:t>*) &gt; 1</w:t>
+        <w:t xml:space="preserve">    HAVING COUNT(*) &gt; 1</w:t>
       </w:r>
     </w:p>
     <w:p>
@@ -12756,13 +12891,8 @@
         <w:ind w:left="115" w:right="115"/>
       </w:pPr>
       <w:r>
-        <w:t xml:space="preserve">) AS </w:t>
-      </w:r>
-      <w:proofErr w:type="spellStart"/>
-      <w:r>
-        <w:t>Duplicate_Groups</w:t>
-      </w:r>
-      <w:proofErr w:type="spellEnd"/>
+        <w:t xml:space="preserve">) AS Duplicate_Groups</w:t>
+      </w:r>
     </w:p>
     <w:p>
       <w:pPr>
@@ -12778,13 +12908,8 @@
         <w:ind w:left="115" w:right="115"/>
       </w:pPr>
       <w:r>
-        <w:t xml:space="preserve">GROUP BY </w:t>
-      </w:r>
-      <w:proofErr w:type="spellStart"/>
-      <w:r>
-        <w:t>FullName</w:t>
-      </w:r>
-      <w:proofErr w:type="spellEnd"/>
+        <w:t xml:space="preserve">GROUP BY FullName</w:t>
+      </w:r>
     </w:p>
     <w:p>
       <w:pPr>
@@ -12800,15 +12925,7 @@
         <w:ind w:left="115" w:right="115"/>
       </w:pPr>
       <w:r>
-        <w:t xml:space="preserve">ORDER BY </w:t>
-      </w:r>
-      <w:proofErr w:type="spellStart"/>
-      <w:r>
-        <w:t>Duplicate_Occasions</w:t>
-      </w:r>
-      <w:proofErr w:type="spellEnd"/>
-      <w:r>
-        <w:t xml:space="preserve"> DESC;</w:t>
+        <w:t xml:space="preserve">ORDER BY Duplicate_Occasions DESC;</w:t>
       </w:r>
     </w:p>
     <w:p>
@@ -12906,20 +13023,11 @@
           <w:b/>
           <w:bCs/>
         </w:rPr>
-        <w:t>Second Highest Risk:</w:t>
-      </w:r>
-      <w:r>
-        <w:t xml:space="preserve"> Employee 50D6FD87 had </w:t>
-      </w:r>
-      <w:r>
-        <w:rPr>
-          <w:b/>
-          <w:bCs/>
-        </w:rPr>
-        <w:t>65 separate duplicate occasions</w:t>
-      </w:r>
-      <w:r>
-        <w:t>.</w:t>
+        <w:t xml:space="preserve">Second Highest Risk:</w:t>
+      </w:r>
+      <w:r>
+        <w:rPr/>
+        <w:t xml:space="preserve"> Employee 50D6FB87 had 65 separate duplicate occasions.</w:t>
       </w:r>
     </w:p>
     <w:p>
@@ -12944,20 +13052,11 @@
           <w:b/>
           <w:bCs/>
         </w:rPr>
-        <w:t>Third Highest Risk:</w:t>
-      </w:r>
-      <w:r>
-        <w:t xml:space="preserve"> Employee DC086243 had </w:t>
-      </w:r>
-      <w:r>
-        <w:rPr>
-          <w:b/>
-          <w:bCs/>
-        </w:rPr>
-        <w:t>44 separate duplicate occasions</w:t>
-      </w:r>
-      <w:r>
-        <w:t>.</w:t>
+        <w:t xml:space="preserve">Third Highest Risk:</w:t>
+      </w:r>
+      <w:r>
+        <w:rPr/>
+        <w:t xml:space="preserve"> Employee DC886243 had 44 separate duplicate occasions.</w:t>
       </w:r>
     </w:p>
     <w:p>
@@ -12982,10 +13081,11 @@
           <w:b/>
           <w:bCs/>
         </w:rPr>
-        <w:t>Other Notable Repeaters:</w:t>
-      </w:r>
-      <w:r>
-        <w:t xml:space="preserve"> Employee 51914657 (36 occasions), Employee B1FA2F0D (33 occasions), Employee 4399674F (33 occasions), and Employee E38DA379 (28 occasions).</w:t>
+        <w:t xml:space="preserve">Other Notable Repeaters:</w:t>
+      </w:r>
+      <w:r>
+        <w:rPr/>
+        <w:t xml:space="preserve"> Employee 51914657 (36 occasions), Employee B1FA2F0D (33 occasions), Employee 4398674F (33 occasions) and Employee E38DA379 (28 occasions).</w:t>
       </w:r>
     </w:p>
     <w:p>
@@ -13205,6 +13305,7 @@
         <w:ind w:left="115" w:right="115"/>
       </w:pPr>
       <w:r>
+        <w:rPr/>
         <w:t xml:space="preserve">The query returned </w:t>
       </w:r>
       <w:r>
@@ -13212,10 +13313,11 @@
           <w:b/>
           <w:bCs/>
         </w:rPr>
-        <w:t>180 rows</w:t>
-      </w:r>
-      <w:r>
-        <w:t xml:space="preserve"> representing four-digit round-thousand whole-dollar purchases (e.g., $1,000, $2,000, $3,000, $4,000, $5,000) during calendar year 2014.</w:t>
+        <w:t xml:space="preserve">160 rows</w:t>
+      </w:r>
+      <w:r>
+        <w:rPr/>
+        <w:t xml:space="preserve"> representing four-digit round-thousand purchases in calendar year 2014: 77 at $1,000, 32 at $2,000, 24 at $3,000, 6 at $4,000, 20 at $5,000 and 1 at $6,000.</w:t>
       </w:r>
     </w:p>
     <w:p>
@@ -13268,10 +13370,11 @@
           <w:b/>
           <w:bCs/>
         </w:rPr>
-        <w:t>Example 2:</w:t>
-      </w:r>
-      <w:r>
-        <w:t xml:space="preserve"> Employee F260038E spent $5,000.00 at AAC CENTER for GENERAL PURCHASE.</w:t>
+        <w:t xml:space="preserve">Example 2:</w:t>
+      </w:r>
+      <w:r>
+        <w:rPr/>
+        <w:t xml:space="preserve"> Employee F260D38E spent $5,000.00 at AAC CENTER for GENERAL PURCHASE.</w:t>
       </w:r>
     </w:p>
     <w:p>
@@ -13324,10 +13427,11 @@
           <w:b/>
           <w:bCs/>
         </w:rPr>
-        <w:t>Example 4:</w:t>
-      </w:r>
-      <w:r>
-        <w:t xml:space="preserve"> Employees 50A61357 and 900F1169 each made $2,000.00 purchases at ABET, INC.</w:t>
+        <w:t xml:space="preserve">Example 4:</w:t>
+      </w:r>
+      <w:r>
+        <w:rPr/>
+        <w:t xml:space="preserve"> Employees 5BA61357 and 900F1169 each made $2,000.00 purchases at ABET, INC.</w:t>
       </w:r>
     </w:p>
     <w:p>
@@ -13344,7 +13448,7 @@
       </w:r>
       <w:proofErr w:type="gramEnd"/>
       <w:r>
-        <w:t xml:space="preserve">  Student-defined fraud test</w:t>
+        <w:t xml:space="preserve">  Splitting a purchase across consecutive days</w:t>
       </w:r>
     </w:p>
     <w:p>
@@ -13360,7 +13464,7 @@
         <w:pStyle w:val="ControlFieldText"/>
       </w:pPr>
       <w:r>
-        <w:t>Define and perform an additional fraud-focused question using the OSU 2014 data. State the fraud risk or hypothesis, explain the test and desired output, avoid duplicating Questions 1-4, and use professional judgment to reduce false positives.</w:t>
+        <w:t xml:space="preserve">Hypothesis: a cardholder can avoid the $5,000 limit, and the same-day split tests in Controls 4–6, by buying from the same vendor on different days. Find pairs of 2014 charges by the same cardholder at the same vendor, each at or below $5,000, made 1 to 7 days apart, whose combined total exceeds $5,000. Show the cardholder, vendor, both dates and amounts, and the combined total, largest first. Limiting the window to one week removes unrelated purchases made months apart.</w:t>
       </w:r>
     </w:p>
     <w:p>
@@ -13394,7 +13498,7 @@
         <w:ind w:left="115" w:right="115"/>
       </w:pPr>
       <w:r>
-        <w:t xml:space="preserve">SELECT </w:t>
+        <w:t xml:space="preserve">WITH parsed AS (</w:t>
       </w:r>
     </w:p>
     <w:p>
@@ -13411,15 +13515,7 @@
         <w:ind w:left="115" w:right="115"/>
       </w:pPr>
       <w:r>
-        <w:t xml:space="preserve">    t</w:t>
-      </w:r>
-      <w:proofErr w:type="gramStart"/>
-      <w:r>
-        <w:t>1.FullName</w:t>
-      </w:r>
-      <w:proofErr w:type="gramEnd"/>
-      <w:r>
-        <w:t xml:space="preserve">, </w:t>
+        <w:t xml:space="preserve">    SELECT *,</w:t>
       </w:r>
     </w:p>
     <w:p>
@@ -13436,15 +13532,7 @@
         <w:ind w:left="115" w:right="115"/>
       </w:pPr>
       <w:r>
-        <w:t xml:space="preserve">    t</w:t>
-      </w:r>
-      <w:proofErr w:type="gramStart"/>
-      <w:r>
-        <w:t>1.Vendor</w:t>
-      </w:r>
-      <w:proofErr w:type="gramEnd"/>
-      <w:r>
-        <w:t xml:space="preserve">, </w:t>
+        <w:t xml:space="preserve">        CAST(substr(TransactionDate, 1, instr(TransactionDate, '/') - 1) AS INT) AS m,</w:t>
       </w:r>
     </w:p>
     <w:p>
@@ -13461,15 +13549,7 @@
         <w:ind w:left="115" w:right="115"/>
       </w:pPr>
       <w:r>
-        <w:t xml:space="preserve">    t</w:t>
-      </w:r>
-      <w:proofErr w:type="gramStart"/>
-      <w:r>
-        <w:t>1.TransactionDate</w:t>
-      </w:r>
-      <w:proofErr w:type="gramEnd"/>
-      <w:r>
-        <w:t xml:space="preserve"> AS Date1, </w:t>
+        <w:t xml:space="preserve">        substr(TransactionDate, instr(TransactionDate, '/') + 1) AS rest</w:t>
       </w:r>
     </w:p>
     <w:p>
@@ -13486,15 +13566,7 @@
         <w:ind w:left="115" w:right="115"/>
       </w:pPr>
       <w:r>
-        <w:t xml:space="preserve">    t</w:t>
-      </w:r>
-      <w:proofErr w:type="gramStart"/>
-      <w:r>
-        <w:t>1.Amount</w:t>
-      </w:r>
-      <w:proofErr w:type="gramEnd"/>
-      <w:r>
-        <w:t xml:space="preserve"> AS Amount1, </w:t>
+        <w:t xml:space="preserve">    FROM pcards</w:t>
       </w:r>
     </w:p>
     <w:p>
@@ -13511,15 +13583,7 @@
         <w:ind w:left="115" w:right="115"/>
       </w:pPr>
       <w:r>
-        <w:t xml:space="preserve">    t</w:t>
-      </w:r>
-      <w:proofErr w:type="gramStart"/>
-      <w:r>
-        <w:t>2.TransactionDate</w:t>
-      </w:r>
-      <w:proofErr w:type="gramEnd"/>
-      <w:r>
-        <w:t xml:space="preserve"> AS Date2, </w:t>
+        <w:t xml:space="preserve">    WHERE Year = 2014 AND Amount &gt; 0 AND Amount &lt;= 5000</w:t>
       </w:r>
     </w:p>
     <w:p>
@@ -13536,15 +13600,7 @@
         <w:ind w:left="115" w:right="115"/>
       </w:pPr>
       <w:r>
-        <w:t xml:space="preserve">    t</w:t>
-      </w:r>
-      <w:proofErr w:type="gramStart"/>
-      <w:r>
-        <w:t>2.Amount</w:t>
-      </w:r>
-      <w:proofErr w:type="gramEnd"/>
-      <w:r>
-        <w:t xml:space="preserve"> AS Amount2,</w:t>
+        <w:t xml:space="preserve">),</w:t>
       </w:r>
     </w:p>
     <w:p>
@@ -13561,29 +13617,8 @@
         <w:ind w:left="115" w:right="115"/>
       </w:pPr>
       <w:r>
-        <w:t xml:space="preserve">    (t</w:t>
-      </w:r>
-      <w:proofErr w:type="gramStart"/>
-      <w:r>
-        <w:t>1.Amount</w:t>
-      </w:r>
-      <w:proofErr w:type="gramEnd"/>
-      <w:r>
-        <w:t xml:space="preserve"> + t</w:t>
-      </w:r>
-      <w:proofErr w:type="gramStart"/>
-      <w:r>
-        <w:t>2.Amount</w:t>
-      </w:r>
-      <w:proofErr w:type="gramEnd"/>
-      <w:r>
-        <w:t xml:space="preserve">) AS </w:t>
-      </w:r>
-      <w:proofErr w:type="spellStart"/>
-      <w:r>
-        <w:t>Total_Combined_Amount</w:t>
-      </w:r>
-      <w:proofErr w:type="spellEnd"/>
+        <w:t xml:space="preserve">dated AS (</w:t>
+      </w:r>
     </w:p>
     <w:p>
       <w:pPr>
@@ -13599,15 +13634,7 @@
         <w:ind w:left="115" w:right="115"/>
       </w:pPr>
       <w:r>
-        <w:t xml:space="preserve">FROM </w:t>
-      </w:r>
-      <w:proofErr w:type="spellStart"/>
-      <w:r>
-        <w:t>pcards</w:t>
-      </w:r>
-      <w:proofErr w:type="spellEnd"/>
-      <w:r>
-        <w:t xml:space="preserve"> t1</w:t>
+        <w:t xml:space="preserve">    SELECT *,</w:t>
       </w:r>
     </w:p>
     <w:p>
@@ -13624,15 +13651,7 @@
         <w:ind w:left="115" w:right="115"/>
       </w:pPr>
       <w:r>
-        <w:t xml:space="preserve">JOIN </w:t>
-      </w:r>
-      <w:proofErr w:type="spellStart"/>
-      <w:r>
-        <w:t>pcards</w:t>
-      </w:r>
-      <w:proofErr w:type="spellEnd"/>
-      <w:r>
-        <w:t xml:space="preserve"> t2 </w:t>
+        <w:t xml:space="preserve">        julianday(substr(rest, instr(rest, '/') + 1, 4) || '-' || printf('%02d', m) || '-' ||</w:t>
       </w:r>
     </w:p>
     <w:p>
@@ -13649,24 +13668,7 @@
         <w:ind w:left="115" w:right="115"/>
       </w:pPr>
       <w:r>
-        <w:lastRenderedPageBreak/>
-        <w:t xml:space="preserve">  ON t</w:t>
-      </w:r>
-      <w:proofErr w:type="gramStart"/>
-      <w:r>
-        <w:t>1.FullName</w:t>
-      </w:r>
-      <w:proofErr w:type="gramEnd"/>
-      <w:r>
-        <w:t xml:space="preserve"> = t</w:t>
-      </w:r>
-      <w:proofErr w:type="gramStart"/>
-      <w:r>
-        <w:t>2.FullName</w:t>
-      </w:r>
-      <w:proofErr w:type="gramEnd"/>
-      <w:r>
-        <w:t xml:space="preserve"> </w:t>
+        <w:t xml:space="preserve">                  printf('%02d', CAST(substr(rest, 1, instr(rest, '/') - 1) AS INT))) AS TxDay</w:t>
       </w:r>
     </w:p>
     <w:p>
@@ -13683,23 +13685,7 @@
         <w:ind w:left="115" w:right="115"/>
       </w:pPr>
       <w:r>
-        <w:t xml:space="preserve"> AND t</w:t>
-      </w:r>
-      <w:proofErr w:type="gramStart"/>
-      <w:r>
-        <w:t>1.Vendor</w:t>
-      </w:r>
-      <w:proofErr w:type="gramEnd"/>
-      <w:r>
-        <w:t xml:space="preserve"> = t</w:t>
-      </w:r>
-      <w:proofErr w:type="gramStart"/>
-      <w:r>
-        <w:t>2.Vendor</w:t>
-      </w:r>
-      <w:proofErr w:type="gramEnd"/>
-      <w:r>
-        <w:t xml:space="preserve"> </w:t>
+        <w:t xml:space="preserve">    FROM parsed</w:t>
       </w:r>
     </w:p>
     <w:p>
@@ -13716,7 +13702,7 @@
         <w:ind w:left="115" w:right="115"/>
       </w:pPr>
       <w:r>
-        <w:t xml:space="preserve"> AND t1.id &lt; t2.id</w:t>
+        <w:t xml:space="preserve">)</w:t>
       </w:r>
     </w:p>
     <w:p>
@@ -13733,23 +13719,7 @@
         <w:ind w:left="115" w:right="115"/>
       </w:pPr>
       <w:r>
-        <w:t>WHERE t</w:t>
-      </w:r>
-      <w:proofErr w:type="gramStart"/>
-      <w:r>
-        <w:t>1.Year</w:t>
-      </w:r>
-      <w:proofErr w:type="gramEnd"/>
-      <w:r>
-        <w:t xml:space="preserve"> = 2014 AND t</w:t>
-      </w:r>
-      <w:proofErr w:type="gramStart"/>
-      <w:r>
-        <w:t>2.Year</w:t>
-      </w:r>
-      <w:proofErr w:type="gramEnd"/>
-      <w:r>
-        <w:t xml:space="preserve"> = 2014</w:t>
+        <w:t xml:space="preserve">SELECT</w:t>
       </w:r>
     </w:p>
     <w:p>
@@ -13766,23 +13736,7 @@
         <w:ind w:left="115" w:right="115"/>
       </w:pPr>
       <w:r>
-        <w:t xml:space="preserve">  AND t</w:t>
-      </w:r>
-      <w:proofErr w:type="gramStart"/>
-      <w:r>
-        <w:t>1.Amount</w:t>
-      </w:r>
-      <w:proofErr w:type="gramEnd"/>
-      <w:r>
-        <w:t xml:space="preserve"> &gt; 0 AND t</w:t>
-      </w:r>
-      <w:proofErr w:type="gramStart"/>
-      <w:r>
-        <w:t>2.Amount</w:t>
-      </w:r>
-      <w:proofErr w:type="gramEnd"/>
-      <w:r>
-        <w:t xml:space="preserve"> &gt; 0</w:t>
+        <w:t xml:space="preserve">    t1.FullName,</w:t>
       </w:r>
     </w:p>
     <w:p>
@@ -13799,23 +13753,7 @@
         <w:ind w:left="115" w:right="115"/>
       </w:pPr>
       <w:r>
-        <w:t xml:space="preserve">  AND (t</w:t>
-      </w:r>
-      <w:proofErr w:type="gramStart"/>
-      <w:r>
-        <w:t>1.Amount</w:t>
-      </w:r>
-      <w:proofErr w:type="gramEnd"/>
-      <w:r>
-        <w:t xml:space="preserve"> + t</w:t>
-      </w:r>
-      <w:proofErr w:type="gramStart"/>
-      <w:r>
-        <w:t>2.Amount</w:t>
-      </w:r>
-      <w:proofErr w:type="gramEnd"/>
-      <w:r>
-        <w:t>) &gt; 5000</w:t>
+        <w:t xml:space="preserve">    t1.Vendor,</w:t>
       </w:r>
     </w:p>
     <w:p>
@@ -13832,15 +13770,194 @@
         <w:ind w:left="115" w:right="115"/>
       </w:pPr>
       <w:r>
-        <w:t xml:space="preserve">ORDER BY </w:t>
-      </w:r>
-      <w:proofErr w:type="spellStart"/>
-      <w:r>
-        <w:t>Total_Combined_Amount</w:t>
-      </w:r>
-      <w:proofErr w:type="spellEnd"/>
-      <w:r>
-        <w:t xml:space="preserve"> DESC;</w:t>
+        <w:t xml:space="preserve">    t1.TransactionDate AS Date1,</w:t>
+      </w:r>
+    </w:p>
+    <w:p>
+      <w:pPr>
+        <w:pStyle w:val="SQLQueryBlock"/>
+        <w:pBdr>
+          <w:top w:val="single" w:sz="4" w:space="4" w:color="B7C1CC"/>
+          <w:left w:val="single" w:sz="4" w:space="4" w:color="B7C1CC"/>
+          <w:bottom w:val="single" w:sz="4" w:space="4" w:color="B7C1CC"/>
+          <w:right w:val="single" w:sz="4" w:space="4" w:color="B7C1CC"/>
+        </w:pBdr>
+        <w:shd w:val="clear" w:color="auto" w:fill="F3F5F7"/>
+        <w:spacing w:before="40" w:after="120"/>
+        <w:ind w:left="115" w:right="115"/>
+      </w:pPr>
+      <w:r>
+        <w:t xml:space="preserve">    t1.Amount AS Amount1,</w:t>
+      </w:r>
+    </w:p>
+    <w:p>
+      <w:pPr>
+        <w:pStyle w:val="SQLQueryBlock"/>
+        <w:pBdr>
+          <w:top w:val="single" w:sz="4" w:space="4" w:color="B7C1CC"/>
+          <w:left w:val="single" w:sz="4" w:space="4" w:color="B7C1CC"/>
+          <w:bottom w:val="single" w:sz="4" w:space="4" w:color="B7C1CC"/>
+          <w:right w:val="single" w:sz="4" w:space="4" w:color="B7C1CC"/>
+        </w:pBdr>
+        <w:shd w:val="clear" w:color="auto" w:fill="F3F5F7"/>
+        <w:spacing w:before="40" w:after="120"/>
+        <w:ind w:left="115" w:right="115"/>
+      </w:pPr>
+      <w:r>
+        <w:t xml:space="preserve">    t2.TransactionDate AS Date2,</w:t>
+      </w:r>
+    </w:p>
+    <w:p>
+      <w:pPr>
+        <w:pStyle w:val="SQLQueryBlock"/>
+        <w:pBdr>
+          <w:top w:val="single" w:sz="4" w:space="4" w:color="B7C1CC"/>
+          <w:left w:val="single" w:sz="4" w:space="4" w:color="B7C1CC"/>
+          <w:bottom w:val="single" w:sz="4" w:space="4" w:color="B7C1CC"/>
+          <w:right w:val="single" w:sz="4" w:space="4" w:color="B7C1CC"/>
+        </w:pBdr>
+        <w:shd w:val="clear" w:color="auto" w:fill="F3F5F7"/>
+        <w:spacing w:before="40" w:after="120"/>
+        <w:ind w:left="115" w:right="115"/>
+      </w:pPr>
+      <w:r>
+        <w:t xml:space="preserve">    t2.Amount AS Amount2,</w:t>
+      </w:r>
+    </w:p>
+    <w:p>
+      <w:pPr>
+        <w:pStyle w:val="SQLQueryBlock"/>
+        <w:pBdr>
+          <w:top w:val="single" w:sz="4" w:space="4" w:color="B7C1CC"/>
+          <w:left w:val="single" w:sz="4" w:space="4" w:color="B7C1CC"/>
+          <w:bottom w:val="single" w:sz="4" w:space="4" w:color="B7C1CC"/>
+          <w:right w:val="single" w:sz="4" w:space="4" w:color="B7C1CC"/>
+        </w:pBdr>
+        <w:shd w:val="clear" w:color="auto" w:fill="F3F5F7"/>
+        <w:spacing w:before="40" w:after="120"/>
+        <w:ind w:left="115" w:right="115"/>
+      </w:pPr>
+      <w:r>
+        <w:t xml:space="preserve">    ROUND(t1.Amount + t2.Amount, 2) AS Total_Combined_Amount</w:t>
+      </w:r>
+    </w:p>
+    <w:p>
+      <w:pPr>
+        <w:pStyle w:val="SQLQueryBlock"/>
+        <w:pBdr>
+          <w:top w:val="single" w:sz="4" w:space="4" w:color="B7C1CC"/>
+          <w:left w:val="single" w:sz="4" w:space="4" w:color="B7C1CC"/>
+          <w:bottom w:val="single" w:sz="4" w:space="4" w:color="B7C1CC"/>
+          <w:right w:val="single" w:sz="4" w:space="4" w:color="B7C1CC"/>
+        </w:pBdr>
+        <w:shd w:val="clear" w:color="auto" w:fill="F3F5F7"/>
+        <w:spacing w:before="40" w:after="120"/>
+        <w:ind w:left="115" w:right="115"/>
+      </w:pPr>
+      <w:r>
+        <w:t xml:space="preserve">FROM dated t1</w:t>
+      </w:r>
+    </w:p>
+    <w:p>
+      <w:pPr>
+        <w:pStyle w:val="SQLQueryBlock"/>
+        <w:pBdr>
+          <w:top w:val="single" w:sz="4" w:space="4" w:color="B7C1CC"/>
+          <w:left w:val="single" w:sz="4" w:space="4" w:color="B7C1CC"/>
+          <w:bottom w:val="single" w:sz="4" w:space="4" w:color="B7C1CC"/>
+          <w:right w:val="single" w:sz="4" w:space="4" w:color="B7C1CC"/>
+        </w:pBdr>
+        <w:shd w:val="clear" w:color="auto" w:fill="F3F5F7"/>
+        <w:spacing w:before="40" w:after="120"/>
+        <w:ind w:left="115" w:right="115"/>
+      </w:pPr>
+      <w:r>
+        <w:t xml:space="preserve">JOIN dated t2</w:t>
+      </w:r>
+    </w:p>
+    <w:p>
+      <w:pPr>
+        <w:pStyle w:val="SQLQueryBlock"/>
+        <w:pBdr>
+          <w:top w:val="single" w:sz="4" w:space="4" w:color="B7C1CC"/>
+          <w:left w:val="single" w:sz="4" w:space="4" w:color="B7C1CC"/>
+          <w:bottom w:val="single" w:sz="4" w:space="4" w:color="B7C1CC"/>
+          <w:right w:val="single" w:sz="4" w:space="4" w:color="B7C1CC"/>
+        </w:pBdr>
+        <w:shd w:val="clear" w:color="auto" w:fill="F3F5F7"/>
+        <w:spacing w:before="40" w:after="120"/>
+        <w:ind w:left="115" w:right="115"/>
+      </w:pPr>
+      <w:r>
+        <w:t xml:space="preserve">  ON t1.FullName = t2.FullName</w:t>
+      </w:r>
+    </w:p>
+    <w:p>
+      <w:pPr>
+        <w:pStyle w:val="SQLQueryBlock"/>
+        <w:pBdr>
+          <w:top w:val="single" w:sz="4" w:space="4" w:color="B7C1CC"/>
+          <w:left w:val="single" w:sz="4" w:space="4" w:color="B7C1CC"/>
+          <w:bottom w:val="single" w:sz="4" w:space="4" w:color="B7C1CC"/>
+          <w:right w:val="single" w:sz="4" w:space="4" w:color="B7C1CC"/>
+        </w:pBdr>
+        <w:shd w:val="clear" w:color="auto" w:fill="F3F5F7"/>
+        <w:spacing w:before="40" w:after="120"/>
+        <w:ind w:left="115" w:right="115"/>
+      </w:pPr>
+      <w:r>
+        <w:t xml:space="preserve"> AND t1.Vendor = t2.Vendor</w:t>
+      </w:r>
+    </w:p>
+    <w:p>
+      <w:pPr>
+        <w:pStyle w:val="SQLQueryBlock"/>
+        <w:pBdr>
+          <w:top w:val="single" w:sz="4" w:space="4" w:color="B7C1CC"/>
+          <w:left w:val="single" w:sz="4" w:space="4" w:color="B7C1CC"/>
+          <w:bottom w:val="single" w:sz="4" w:space="4" w:color="B7C1CC"/>
+          <w:right w:val="single" w:sz="4" w:space="4" w:color="B7C1CC"/>
+        </w:pBdr>
+        <w:shd w:val="clear" w:color="auto" w:fill="F3F5F7"/>
+        <w:spacing w:before="40" w:after="120"/>
+        <w:ind w:left="115" w:right="115"/>
+      </w:pPr>
+      <w:r>
+        <w:t xml:space="preserve"> AND t2.TxDay - t1.TxDay BETWEEN 1 AND 7</w:t>
+      </w:r>
+    </w:p>
+    <w:p>
+      <w:pPr>
+        <w:pStyle w:val="SQLQueryBlock"/>
+        <w:pBdr>
+          <w:top w:val="single" w:sz="4" w:space="4" w:color="B7C1CC"/>
+          <w:left w:val="single" w:sz="4" w:space="4" w:color="B7C1CC"/>
+          <w:bottom w:val="single" w:sz="4" w:space="4" w:color="B7C1CC"/>
+          <w:right w:val="single" w:sz="4" w:space="4" w:color="B7C1CC"/>
+        </w:pBdr>
+        <w:shd w:val="clear" w:color="auto" w:fill="F3F5F7"/>
+        <w:spacing w:before="40" w:after="120"/>
+        <w:ind w:left="115" w:right="115"/>
+      </w:pPr>
+      <w:r>
+        <w:t xml:space="preserve">WHERE t1.Amount + t2.Amount &gt; 5000</w:t>
+      </w:r>
+    </w:p>
+    <w:p>
+      <w:pPr>
+        <w:pStyle w:val="SQLQueryBlock"/>
+        <w:pBdr>
+          <w:top w:val="single" w:sz="4" w:space="4" w:color="B7C1CC"/>
+          <w:left w:val="single" w:sz="4" w:space="4" w:color="B7C1CC"/>
+          <w:bottom w:val="single" w:sz="4" w:space="4" w:color="B7C1CC"/>
+          <w:right w:val="single" w:sz="4" w:space="4" w:color="B7C1CC"/>
+        </w:pBdr>
+        <w:shd w:val="clear" w:color="auto" w:fill="F3F5F7"/>
+        <w:spacing w:before="40" w:after="120"/>
+        <w:ind w:left="115" w:right="115"/>
+      </w:pPr>
+      <w:r>
+        <w:t xml:space="preserve">ORDER BY Total_Combined_Amount DESC;</w:t>
       </w:r>
     </w:p>
     <w:p>
@@ -13865,6 +13982,7 @@
         <w:ind w:left="115" w:right="115"/>
       </w:pPr>
       <w:r>
+        <w:rPr/>
         <w:t xml:space="preserve">The query returned </w:t>
       </w:r>
       <w:r>
@@ -13872,10 +13990,11 @@
           <w:b/>
           <w:bCs/>
         </w:rPr>
-        <w:t>2,487 rows</w:t>
-      </w:r>
-      <w:r>
-        <w:t xml:space="preserve"> representing paired transactions by the same employee at the same vendor whose combined purchase total exceeds the $5,000 single transaction threshold.</w:t>
+        <w:t xml:space="preserve">110 pairs</w:t>
+      </w:r>
+      <w:r>
+        <w:rPr/>
+        <w:t xml:space="preserve"> of transactions involving 24 cardholders.</w:t>
       </w:r>
     </w:p>
     <w:p>
@@ -13900,10 +14019,11 @@
           <w:b/>
           <w:bCs/>
         </w:rPr>
-        <w:t>Top Combined Violation:</w:t>
-      </w:r>
-      <w:r>
-        <w:t xml:space="preserve"> Employee GE3DD5EC spent $21,243.93 across transactions at MAGDALENE COLLEGE.</w:t>
+        <w:t xml:space="preserve">Top Pair:</w:t>
+      </w:r>
+      <w:r>
+        <w:rPr/>
+        <w:t xml:space="preserve"> Employee 16C4B190 paid WIZARD INDUSTRIES $4,986.00 on 5/28/2014 and $5,000.00 on 5/30/2014 ($9,986.00 in total), with both charges right at the limit.</w:t>
       </w:r>
     </w:p>
     <w:p>
@@ -13928,10 +14048,11 @@
           <w:b/>
           <w:bCs/>
         </w:rPr>
-        <w:t>Significant Repeat Vendor Example:</w:t>
-      </w:r>
-      <w:r>
-        <w:t xml:space="preserve"> Employee 302B04AF executed multiple high-value multi-day transactions at COCKRELL EYECARE CENTER, including paired amounts such as $19,233.28 on 12/24/2014 paired with $4,752.66 on 11/14/2014 and $3,656.24 on 10/31/2014.</w:t>
+        <w:t xml:space="preserve">Repeat Pattern:</w:t>
+      </w:r>
+      <w:r>
+        <w:rPr/>
+        <w:t xml:space="preserve"> Employee 51914657 appears in 22 of the 110 pairs, e.g. OKLAHOMA CONTRACTORS SUP ($4,116.00 on 5/15/2014 and $3,383.00 on 5/22/2014) and GRIGSBY'S CARPET SHOWROOM ($2,733.75 on 3/5/2014 and $4,750.00 on 3/10/2014). This employee is also the top spender in Control 1, so it is a high priority for follow-up.</w:t>
       </w:r>
     </w:p>
     <w:p>
@@ -13948,7 +14069,7 @@
       </w:r>
       <w:proofErr w:type="gramEnd"/>
       <w:r>
-        <w:t xml:space="preserve">  Student-defined fraud test</w:t>
+        <w:t xml:space="preserve">  Large restaurant charges on weekends</w:t>
       </w:r>
     </w:p>
     <w:p>
@@ -13964,7 +14085,7 @@
         <w:pStyle w:val="ControlFieldText"/>
       </w:pPr>
       <w:r>
-        <w:t>Define and perform a second additional fraud-focused question using the OSU 2014 data. State the fraud risk or hypothesis, explain the test and desired output, avoid duplicating the earlier questions, and use professional judgment to reduce false positives.</w:t>
+        <w:t xml:space="preserve">Hypothesis: large restaurant bills on a Saturday or Sunday are more likely to be personal or social meals, which do not serve a business purpose. Show the name, vendor, description, amount, date and weekday of all 2014 restaurant transactions (by description or MCC) over $100 made on a weekend. The date text is converted into a real date first so that the weekday is correct. Sort by amount, largest first.</w:t>
       </w:r>
     </w:p>
     <w:p>
@@ -13998,21 +14119,8 @@
         <w:ind w:left="115" w:right="115"/>
       </w:pPr>
       <w:r>
-        <w:t xml:space="preserve">SELECT </w:t>
-      </w:r>
-      <w:proofErr w:type="spellStart"/>
-      <w:r>
-        <w:t>FullName</w:t>
-      </w:r>
-      <w:proofErr w:type="spellEnd"/>
-      <w:r>
-        <w:t xml:space="preserve">, Vendor, Description, Amount, </w:t>
-      </w:r>
-      <w:proofErr w:type="spellStart"/>
-      <w:r>
-        <w:t>TransactionDate</w:t>
-      </w:r>
-      <w:proofErr w:type="spellEnd"/>
+        <w:t xml:space="preserve">WITH parsed AS (</w:t>
+      </w:r>
     </w:p>
     <w:p>
       <w:pPr>
@@ -14028,13 +14136,8 @@
         <w:ind w:left="115" w:right="115"/>
       </w:pPr>
       <w:r>
-        <w:t xml:space="preserve">FROM </w:t>
-      </w:r>
-      <w:proofErr w:type="spellStart"/>
-      <w:r>
-        <w:t>pcards</w:t>
-      </w:r>
-      <w:proofErr w:type="spellEnd"/>
+        <w:t xml:space="preserve">    SELECT *,</w:t>
+      </w:r>
     </w:p>
     <w:p>
       <w:pPr>
@@ -14050,7 +14153,7 @@
         <w:ind w:left="115" w:right="115"/>
       </w:pPr>
       <w:r>
-        <w:t xml:space="preserve">WHERE Year = 2014 </w:t>
+        <w:t xml:space="preserve">        CAST(substr(TransactionDate, 1, instr(TransactionDate, '/') - 1) AS INT) AS m,</w:t>
       </w:r>
     </w:p>
     <w:p>
@@ -14067,7 +14170,7 @@
         <w:ind w:left="115" w:right="115"/>
       </w:pPr>
       <w:r>
-        <w:t xml:space="preserve">  AND Amount &gt; 100</w:t>
+        <w:t xml:space="preserve">        substr(TransactionDate, instr(TransactionDate, '/') + 1) AS rest</w:t>
       </w:r>
     </w:p>
     <w:p>
@@ -14084,7 +14187,7 @@
         <w:ind w:left="115" w:right="115"/>
       </w:pPr>
       <w:r>
-        <w:t xml:space="preserve">  AND (</w:t>
+        <w:t xml:space="preserve">    FROM pcards</w:t>
       </w:r>
     </w:p>
     <w:p>
@@ -14101,7 +14204,7 @@
         <w:ind w:left="115" w:right="115"/>
       </w:pPr>
       <w:r>
-        <w:t xml:space="preserve">      Description LIKE '%restaurant%' </w:t>
+        <w:t xml:space="preserve">    WHERE Year = 2014 AND Amount &gt; 100</w:t>
       </w:r>
     </w:p>
     <w:p>
@@ -14118,7 +14221,7 @@
         <w:ind w:left="115" w:right="115"/>
       </w:pPr>
       <w:r>
-        <w:t xml:space="preserve">      OR Description LIKE '%cafe%' </w:t>
+        <w:t xml:space="preserve">),</w:t>
       </w:r>
     </w:p>
     <w:p>
@@ -14135,7 +14238,7 @@
         <w:ind w:left="115" w:right="115"/>
       </w:pPr>
       <w:r>
-        <w:t xml:space="preserve">      OR Description LIKE '%grill%' </w:t>
+        <w:t xml:space="preserve">dated AS (</w:t>
       </w:r>
     </w:p>
     <w:p>
@@ -14152,7 +14255,7 @@
         <w:ind w:left="115" w:right="115"/>
       </w:pPr>
       <w:r>
-        <w:t xml:space="preserve">      OR Description LIKE '%diner%'</w:t>
+        <w:t xml:space="preserve">    SELECT *,</w:t>
       </w:r>
     </w:p>
     <w:p>
@@ -14169,7 +14272,7 @@
         <w:ind w:left="115" w:right="115"/>
       </w:pPr>
       <w:r>
-        <w:t xml:space="preserve">      OR MCC LIKE '%eating%'</w:t>
+        <w:t xml:space="preserve">        date(substr(rest, instr(rest, '/') + 1, 4) || '-' || printf('%02d', m) || '-' ||</w:t>
       </w:r>
     </w:p>
     <w:p>
@@ -14186,7 +14289,7 @@
         <w:ind w:left="115" w:right="115"/>
       </w:pPr>
       <w:r>
-        <w:t xml:space="preserve">      OR MCC LIKE '%restaurant%'</w:t>
+        <w:t xml:space="preserve">             printf('%02d', CAST(substr(rest, 1, instr(rest, '/') - 1) AS INT))) AS TxDate</w:t>
       </w:r>
     </w:p>
     <w:p>
@@ -14203,7 +14306,7 @@
         <w:ind w:left="115" w:right="115"/>
       </w:pPr>
       <w:r>
-        <w:t xml:space="preserve">  )</w:t>
+        <w:t xml:space="preserve">    FROM parsed</w:t>
       </w:r>
     </w:p>
     <w:p>
@@ -14220,20 +14323,7 @@
         <w:ind w:left="115" w:right="115"/>
       </w:pPr>
       <w:r>
-        <w:t xml:space="preserve">  AND </w:t>
-      </w:r>
-      <w:proofErr w:type="spellStart"/>
-      <w:proofErr w:type="gramStart"/>
-      <w:r>
-        <w:t>strftime</w:t>
-      </w:r>
-      <w:proofErr w:type="spellEnd"/>
-      <w:r>
-        <w:t>(</w:t>
-      </w:r>
-      <w:proofErr w:type="gramEnd"/>
-      <w:r>
-        <w:t xml:space="preserve">'%w', </w:t>
+        <w:t xml:space="preserve">)</w:t>
       </w:r>
     </w:p>
     <w:p>
@@ -14250,25 +14340,7 @@
         <w:ind w:left="115" w:right="115"/>
       </w:pPr>
       <w:r>
-        <w:t xml:space="preserve">        </w:t>
-      </w:r>
-      <w:proofErr w:type="spellStart"/>
-      <w:proofErr w:type="gramStart"/>
-      <w:r>
-        <w:t>substr</w:t>
-      </w:r>
-      <w:proofErr w:type="spellEnd"/>
-      <w:r>
-        <w:t>(</w:t>
-      </w:r>
-      <w:proofErr w:type="spellStart"/>
-      <w:proofErr w:type="gramEnd"/>
-      <w:r>
-        <w:t>TransactionDate</w:t>
-      </w:r>
-      <w:proofErr w:type="spellEnd"/>
-      <w:r>
-        <w:t xml:space="preserve">, 7, 4) || '-' || </w:t>
+        <w:t xml:space="preserve">SELECT FullName, Vendor, Description, Amount, TransactionDate,</w:t>
       </w:r>
     </w:p>
     <w:p>
@@ -14285,59 +14357,7 @@
         <w:ind w:left="115" w:right="115"/>
       </w:pPr>
       <w:r>
-        <w:t xml:space="preserve">        </w:t>
-      </w:r>
-      <w:proofErr w:type="spellStart"/>
-      <w:proofErr w:type="gramStart"/>
-      <w:r>
-        <w:t>printf</w:t>
-      </w:r>
-      <w:proofErr w:type="spellEnd"/>
-      <w:r>
-        <w:t>(</w:t>
-      </w:r>
-      <w:proofErr w:type="gramEnd"/>
-      <w:r>
-        <w:t xml:space="preserve">'%02d', </w:t>
-      </w:r>
-      <w:proofErr w:type="gramStart"/>
-      <w:r>
-        <w:t>CAST(</w:t>
-      </w:r>
-      <w:proofErr w:type="spellStart"/>
-      <w:r>
-        <w:t>substr</w:t>
-      </w:r>
-      <w:proofErr w:type="spellEnd"/>
-      <w:r>
-        <w:t>(</w:t>
-      </w:r>
-      <w:proofErr w:type="spellStart"/>
-      <w:proofErr w:type="gramEnd"/>
-      <w:r>
-        <w:t>TransactionDate</w:t>
-      </w:r>
-      <w:proofErr w:type="spellEnd"/>
-      <w:r>
-        <w:t xml:space="preserve">, 1, </w:t>
-      </w:r>
-      <w:proofErr w:type="spellStart"/>
-      <w:proofErr w:type="gramStart"/>
-      <w:r>
-        <w:t>instr</w:t>
-      </w:r>
-      <w:proofErr w:type="spellEnd"/>
-      <w:r>
-        <w:t>(</w:t>
-      </w:r>
-      <w:proofErr w:type="spellStart"/>
-      <w:proofErr w:type="gramEnd"/>
-      <w:r>
-        <w:t>TransactionDate</w:t>
-      </w:r>
-      <w:proofErr w:type="spellEnd"/>
-      <w:r>
-        <w:t xml:space="preserve">, '/') - 1) AS INT)) || '-' || </w:t>
+        <w:t xml:space="preserve">    CASE strftime('%w', TxDate) WHEN '0' THEN 'Sunday' ELSE 'Saturday' END AS Weekday</w:t>
       </w:r>
     </w:p>
     <w:p>
@@ -14354,104 +14374,7 @@
         <w:ind w:left="115" w:right="115"/>
       </w:pPr>
       <w:r>
-        <w:lastRenderedPageBreak/>
-        <w:t xml:space="preserve">        </w:t>
-      </w:r>
-      <w:proofErr w:type="spellStart"/>
-      <w:proofErr w:type="gramStart"/>
-      <w:r>
-        <w:t>printf</w:t>
-      </w:r>
-      <w:proofErr w:type="spellEnd"/>
-      <w:r>
-        <w:t>(</w:t>
-      </w:r>
-      <w:proofErr w:type="gramEnd"/>
-      <w:r>
-        <w:t xml:space="preserve">'%02d', </w:t>
-      </w:r>
-      <w:proofErr w:type="gramStart"/>
-      <w:r>
-        <w:t>CAST(</w:t>
-      </w:r>
-      <w:proofErr w:type="spellStart"/>
-      <w:r>
-        <w:t>substr</w:t>
-      </w:r>
-      <w:proofErr w:type="spellEnd"/>
-      <w:r>
-        <w:t>(</w:t>
-      </w:r>
-      <w:proofErr w:type="spellStart"/>
-      <w:proofErr w:type="gramEnd"/>
-      <w:r>
-        <w:t>TransactionDate</w:t>
-      </w:r>
-      <w:proofErr w:type="spellEnd"/>
-      <w:r>
-        <w:t xml:space="preserve">, </w:t>
-      </w:r>
-      <w:proofErr w:type="spellStart"/>
-      <w:proofErr w:type="gramStart"/>
-      <w:r>
-        <w:t>instr</w:t>
-      </w:r>
-      <w:proofErr w:type="spellEnd"/>
-      <w:r>
-        <w:t>(</w:t>
-      </w:r>
-      <w:proofErr w:type="spellStart"/>
-      <w:proofErr w:type="gramEnd"/>
-      <w:r>
-        <w:t>TransactionDate</w:t>
-      </w:r>
-      <w:proofErr w:type="spellEnd"/>
-      <w:r>
-        <w:t xml:space="preserve">, '/') + 1, </w:t>
-      </w:r>
-      <w:proofErr w:type="spellStart"/>
-      <w:proofErr w:type="gramStart"/>
-      <w:r>
-        <w:t>instr</w:t>
-      </w:r>
-      <w:proofErr w:type="spellEnd"/>
-      <w:r>
-        <w:t>(</w:t>
-      </w:r>
-      <w:proofErr w:type="spellStart"/>
-      <w:r>
-        <w:t>substr</w:t>
-      </w:r>
-      <w:proofErr w:type="spellEnd"/>
-      <w:r>
-        <w:t>(</w:t>
-      </w:r>
-      <w:proofErr w:type="spellStart"/>
-      <w:proofErr w:type="gramEnd"/>
-      <w:r>
-        <w:t>TransactionDate</w:t>
-      </w:r>
-      <w:proofErr w:type="spellEnd"/>
-      <w:r>
-        <w:t xml:space="preserve">, </w:t>
-      </w:r>
-      <w:proofErr w:type="spellStart"/>
-      <w:proofErr w:type="gramStart"/>
-      <w:r>
-        <w:t>instr</w:t>
-      </w:r>
-      <w:proofErr w:type="spellEnd"/>
-      <w:r>
-        <w:t>(</w:t>
-      </w:r>
-      <w:proofErr w:type="spellStart"/>
-      <w:proofErr w:type="gramEnd"/>
-      <w:r>
-        <w:t>TransactionDate</w:t>
-      </w:r>
-      <w:proofErr w:type="spellEnd"/>
-      <w:r>
-        <w:t>, '/') + 1), '/') - 1) AS INT))</w:t>
+        <w:t xml:space="preserve">FROM dated</w:t>
       </w:r>
     </w:p>
     <w:p>
@@ -14468,7 +14391,7 @@
         <w:ind w:left="115" w:right="115"/>
       </w:pPr>
       <w:r>
-        <w:t xml:space="preserve">      ) IN ('0', '6')</w:t>
+        <w:t xml:space="preserve">WHERE (Description LIKE '%restaurant%'</w:t>
       </w:r>
     </w:p>
     <w:p>
@@ -14485,7 +14408,109 @@
         <w:ind w:left="115" w:right="115"/>
       </w:pPr>
       <w:r>
-        <w:t>ORDER BY Amount DESC;</w:t>
+        <w:t xml:space="preserve">       OR Description LIKE '%cafe%'</w:t>
+      </w:r>
+    </w:p>
+    <w:p>
+      <w:pPr>
+        <w:pStyle w:val="SQLQueryBlock"/>
+        <w:pBdr>
+          <w:top w:val="single" w:sz="4" w:space="4" w:color="B7C1CC"/>
+          <w:left w:val="single" w:sz="4" w:space="4" w:color="B7C1CC"/>
+          <w:bottom w:val="single" w:sz="4" w:space="4" w:color="B7C1CC"/>
+          <w:right w:val="single" w:sz="4" w:space="4" w:color="B7C1CC"/>
+        </w:pBdr>
+        <w:shd w:val="clear" w:color="auto" w:fill="F3F5F7"/>
+        <w:spacing w:before="40" w:after="120"/>
+        <w:ind w:left="115" w:right="115"/>
+      </w:pPr>
+      <w:r>
+        <w:t xml:space="preserve">       OR Description LIKE '%grill%'</w:t>
+      </w:r>
+    </w:p>
+    <w:p>
+      <w:pPr>
+        <w:pStyle w:val="SQLQueryBlock"/>
+        <w:pBdr>
+          <w:top w:val="single" w:sz="4" w:space="4" w:color="B7C1CC"/>
+          <w:left w:val="single" w:sz="4" w:space="4" w:color="B7C1CC"/>
+          <w:bottom w:val="single" w:sz="4" w:space="4" w:color="B7C1CC"/>
+          <w:right w:val="single" w:sz="4" w:space="4" w:color="B7C1CC"/>
+        </w:pBdr>
+        <w:shd w:val="clear" w:color="auto" w:fill="F3F5F7"/>
+        <w:spacing w:before="40" w:after="120"/>
+        <w:ind w:left="115" w:right="115"/>
+      </w:pPr>
+      <w:r>
+        <w:t xml:space="preserve">       OR Description LIKE '%diner%'</w:t>
+      </w:r>
+    </w:p>
+    <w:p>
+      <w:pPr>
+        <w:pStyle w:val="SQLQueryBlock"/>
+        <w:pBdr>
+          <w:top w:val="single" w:sz="4" w:space="4" w:color="B7C1CC"/>
+          <w:left w:val="single" w:sz="4" w:space="4" w:color="B7C1CC"/>
+          <w:bottom w:val="single" w:sz="4" w:space="4" w:color="B7C1CC"/>
+          <w:right w:val="single" w:sz="4" w:space="4" w:color="B7C1CC"/>
+        </w:pBdr>
+        <w:shd w:val="clear" w:color="auto" w:fill="F3F5F7"/>
+        <w:spacing w:before="40" w:after="120"/>
+        <w:ind w:left="115" w:right="115"/>
+      </w:pPr>
+      <w:r>
+        <w:t xml:space="preserve">       OR MCC LIKE '%eating%'</w:t>
+      </w:r>
+    </w:p>
+    <w:p>
+      <w:pPr>
+        <w:pStyle w:val="SQLQueryBlock"/>
+        <w:pBdr>
+          <w:top w:val="single" w:sz="4" w:space="4" w:color="B7C1CC"/>
+          <w:left w:val="single" w:sz="4" w:space="4" w:color="B7C1CC"/>
+          <w:bottom w:val="single" w:sz="4" w:space="4" w:color="B7C1CC"/>
+          <w:right w:val="single" w:sz="4" w:space="4" w:color="B7C1CC"/>
+        </w:pBdr>
+        <w:shd w:val="clear" w:color="auto" w:fill="F3F5F7"/>
+        <w:spacing w:before="40" w:after="120"/>
+        <w:ind w:left="115" w:right="115"/>
+      </w:pPr>
+      <w:r>
+        <w:t xml:space="preserve">       OR MCC LIKE '%restaurant%')</w:t>
+      </w:r>
+    </w:p>
+    <w:p>
+      <w:pPr>
+        <w:pStyle w:val="SQLQueryBlock"/>
+        <w:pBdr>
+          <w:top w:val="single" w:sz="4" w:space="4" w:color="B7C1CC"/>
+          <w:left w:val="single" w:sz="4" w:space="4" w:color="B7C1CC"/>
+          <w:bottom w:val="single" w:sz="4" w:space="4" w:color="B7C1CC"/>
+          <w:right w:val="single" w:sz="4" w:space="4" w:color="B7C1CC"/>
+        </w:pBdr>
+        <w:shd w:val="clear" w:color="auto" w:fill="F3F5F7"/>
+        <w:spacing w:before="40" w:after="120"/>
+        <w:ind w:left="115" w:right="115"/>
+      </w:pPr>
+      <w:r>
+        <w:t xml:space="preserve">  AND strftime('%w', TxDate) IN ('0', '6')</w:t>
+      </w:r>
+    </w:p>
+    <w:p>
+      <w:pPr>
+        <w:pStyle w:val="SQLQueryBlock"/>
+        <w:pBdr>
+          <w:top w:val="single" w:sz="4" w:space="4" w:color="B7C1CC"/>
+          <w:left w:val="single" w:sz="4" w:space="4" w:color="B7C1CC"/>
+          <w:bottom w:val="single" w:sz="4" w:space="4" w:color="B7C1CC"/>
+          <w:right w:val="single" w:sz="4" w:space="4" w:color="B7C1CC"/>
+        </w:pBdr>
+        <w:shd w:val="clear" w:color="auto" w:fill="F3F5F7"/>
+        <w:spacing w:before="40" w:after="120"/>
+        <w:ind w:left="115" w:right="115"/>
+      </w:pPr>
+      <w:r>
+        <w:t xml:space="preserve">ORDER BY Amount DESC;</w:t>
       </w:r>
     </w:p>
     <w:p>
@@ -14510,6 +14535,7 @@
         <w:ind w:left="115" w:right="115"/>
       </w:pPr>
       <w:r>
+        <w:rPr/>
         <w:t xml:space="preserve">The query returned </w:t>
       </w:r>
       <w:r>
@@ -14517,10 +14543,11 @@
           <w:b/>
           <w:bCs/>
         </w:rPr>
-        <w:t>51 rows</w:t>
-      </w:r>
-      <w:r>
-        <w:t xml:space="preserve"> representing high-value dining and restaurant expenditures incurred over weekends (Saturdays and Sundays) exceeding $100 during calendar year 2014.</w:t>
+        <w:t xml:space="preserve">405 weekend restaurant transactions</w:t>
+      </w:r>
+      <w:r>
+        <w:rPr/>
+        <w:t xml:space="preserve"> over $100 by 114 cardholders, totalling $157,057.27.</w:t>
       </w:r>
     </w:p>
     <w:p>
@@ -14545,10 +14572,11 @@
           <w:b/>
           <w:bCs/>
         </w:rPr>
-        <w:t>Top Violation:</w:t>
-      </w:r>
-      <w:r>
-        <w:t xml:space="preserve"> Employee 93F6DC86 spent $3,503.76 at LO-LO'S CHICKEN &amp; WAFFLE on Sunday, 12/28/2014.</w:t>
+        <w:t xml:space="preserve">Top Transaction:</w:t>
+      </w:r>
+      <w:r>
+        <w:rPr/>
+        <w:t xml:space="preserve"> Employee 7CBE6ACB spent $4,985.75 at CHEROKEE STRIP BARBEQUE C on Saturday, 4/5/2014, which is also just under the $5,000 limit.</w:t>
       </w:r>
     </w:p>
     <w:p>
@@ -14573,10 +14601,11 @@
           <w:b/>
           <w:bCs/>
         </w:rPr>
-        <w:t>Second Highest Violation:</w:t>
-      </w:r>
-      <w:r>
-        <w:t xml:space="preserve"> Employee 5C39F90C spent $3,500.00 at MGM GRAND/CRAFTSTEAK on Saturday, 11/22/2014.</w:t>
+        <w:t xml:space="preserve">Second Highest:</w:t>
+      </w:r>
+      <w:r>
+        <w:rPr/>
+        <w:t xml:space="preserve"> Employee 465E5080 spent $3,601.20 at HOUSTON TEXANS GRI on Saturday, 3/1/2014.</w:t>
       </w:r>
     </w:p>
     <w:p>
@@ -14601,10 +14630,11 @@
           <w:b/>
           <w:bCs/>
         </w:rPr>
-        <w:t>Third Highest Violation:</w:t>
-      </w:r>
-      <w:r>
-        <w:t xml:space="preserve"> Employee A0D1B20A spent $2,150.76 at RAISING CANE'S AZ3 on Saturday, 12/27/2014.</w:t>
+        <w:t xml:space="preserve">Third Highest:</w:t>
+      </w:r>
+      <w:r>
+        <w:rPr/>
+        <w:t xml:space="preserve"> Employee 93F6DC86 spent $3,503.76 at LO-LO'S CHICKEN &amp; WAFFLE on Sunday, 12/28/2014.</w:t>
       </w:r>
     </w:p>
     <w:p>
@@ -14629,10 +14659,11 @@
           <w:b/>
           <w:bCs/>
         </w:rPr>
-        <w:t>Other High-Value Examples:</w:t>
-      </w:r>
-      <w:r>
-        <w:t xml:space="preserve"> Employee 5C39F90C ($1,148.77 at THE OLIVE GARD00044263 on 12/20/2014), Employee 1A6D9F26 ($1,077.47 at J FORDS BLACK ANGUS on 11/22/2014), and Employee 5C39F90C ($1,072.56 at 3FEDEX FORUM 15099906 on 12/13/2014).</w:t>
+        <w:t xml:space="preserve">Other Examples:</w:t>
+      </w:r>
+      <w:r>
+        <w:rPr/>
+        <w:t xml:space="preserve"> Employee 5C39F90C ($3,500.00 at MGM GRAND/CRAFTSTEAK on Saturday, 11/22/2014) and Employee 3B53C9B0 ($2,698.16 at PANERA BREAD on Saturday, 12/6/2014). Catering for weekend events can be legitimate, so the business purpose should be checked.</w:t>
       </w:r>
     </w:p>
     <w:p>
@@ -14649,7 +14680,7 @@
       </w:r>
       <w:proofErr w:type="gramEnd"/>
       <w:r>
-        <w:t xml:space="preserve">  Student-defined fraud test</w:t>
+        <w:t xml:space="preserve">  Large purchases at consumer retailers</w:t>
       </w:r>
     </w:p>
     <w:p>
@@ -14665,7 +14696,7 @@
         <w:pStyle w:val="ControlFieldText"/>
       </w:pPr>
       <w:r>
-        <w:t>Define and perform a third additional fraud-focused question using the OSU 2014 data. State the fraud risk or hypothesis, explain the test and desired output, avoid duplicating the earlier questions, and use professional judgment to reduce false positives.</w:t>
+        <w:t xml:space="preserve">Hypothesis: P-cards may be used for personal purchases of consumer electronics and household goods, which are easiest to hide among purchases at big-box and online retailers. Show the name, vendor, description, amount and transaction date for all 2014 transactions of $500 or more at Walmart, Best Buy, Target, Amazon, Apple, Sam's Club or Costco. Sort by amount, largest first.</w:t>
       </w:r>
     </w:p>
     <w:p>
@@ -14964,6 +14995,7 @@
         <w:ind w:left="115" w:right="115"/>
       </w:pPr>
       <w:r>
+        <w:rPr/>
         <w:t xml:space="preserve">The query returned </w:t>
       </w:r>
       <w:r>
@@ -14971,10 +15003,11 @@
           <w:b/>
           <w:bCs/>
         </w:rPr>
-        <w:t>403 rows</w:t>
-      </w:r>
-      <w:r>
-        <w:t xml:space="preserve"> representing purchases of $500 or more executed at major big-box retailers, consumer electronics vendors, and online marketplaces during calendar year 2014.</w:t>
+        <w:t xml:space="preserve">403 transactions</w:t>
+      </w:r>
+      <w:r>
+        <w:rPr/>
+        <w:t xml:space="preserve"> by 195 cardholders, totalling $442,141.56, at major retailers and online marketplaces. Some vendor matches are unrelated businesses (e.g. "JOBTARGET LLC"), so the list needs a quick manual review.</w:t>
       </w:r>
     </w:p>
     <w:p>
@@ -14999,10 +15032,11 @@
           <w:b/>
           <w:bCs/>
         </w:rPr>
-        <w:t>Top Violation:</w:t>
-      </w:r>
-      <w:r>
-        <w:t xml:space="preserve"> Employee A1DDFFCC spent $500.00 at Amazon Payments for GENERAL PURCHASE.</w:t>
+        <w:t xml:space="preserve">Top Transaction:</w:t>
+      </w:r>
+      <w:r>
+        <w:rPr/>
+        <w:t xml:space="preserve"> Employee A1DDFECC spent $5,000.00 at Amazon Payments for GENERAL PURCHASE on 10/31/2014. This is a round amount with no item detail.</w:t>
       </w:r>
     </w:p>
     <w:p>
@@ -15027,10 +15061,11 @@
           <w:b/>
           <w:bCs/>
         </w:rPr>
-        <w:t>Electronics &amp; Hardware Purchases:</w:t>
-      </w:r>
-      <w:r>
-        <w:t xml:space="preserve"> Employee 00C88F93 spent $499.00 (or $450+) at AMAZON MKTPLACE PMTS for a Nikon Coolpix AW120 Shock PCE; Employee 5BE90A79 spent $399.00+ at BEST BUY 00014993 for SANUS VLT5-B1 TILT / ROCKETFISH items; Employee 27D1EC36 spent $370.00+ at Amazon.com for a Tektronix TDS2014C Portable Oscilloscope; and Employee 4FAB6AB9 spent $360.00+ at Amazon.com for a VIZIO M301d-A3R 30-Inch 1080p HDTV.</w:t>
+        <w:t xml:space="preserve">Electronics Purchases:</w:t>
+      </w:r>
+      <w:r>
+        <w:rPr/>
+        <w:t xml:space="preserve"> Employee 00CA8F93 spent $4,926.60 at AMAZON MKTPLACE PMTS for Nikon Coolpix AW120 cameras; Employee 5BE90A78 spent $3,929.91 at BEST BUY for SANUS/ROCKETFISH TV mounts; Employee 27D1EC36 spent $3,726.00 at Amazon.com for a Tektronix oscilloscope (lab equipment, likely legitimate).</w:t>
       </w:r>
     </w:p>
     <w:p>
@@ -15047,7 +15082,7 @@
       </w:r>
       <w:proofErr w:type="gramEnd"/>
       <w:r>
-        <w:t xml:space="preserve">  Student-defined fraud test</w:t>
+        <w:t xml:space="preserve">  Cardholders who repeatedly buy just under the limit</w:t>
       </w:r>
     </w:p>
     <w:p>
@@ -15063,7 +15098,7 @@
         <w:pStyle w:val="ControlFieldText"/>
       </w:pPr>
       <w:r>
-        <w:t>Define and perform a fourth additional fraud-focused question using the OSU 2014 data. State the fraud risk or hypothesis, explain the test and desired output, avoid duplicating the earlier questions, and use professional judgment to reduce false positives.</w:t>
+        <w:t xml:space="preserve">Hypothesis: a cardholder who often makes purchases between $4,000.00 and $4,999.99 may be routinely structuring purchases to stay under the $5,000 limit. For each cardholder, count the 2014 transactions in this range and total their amount. Sort by count, then total, largest first.</w:t>
       </w:r>
     </w:p>
     <w:p>
@@ -15315,6 +15350,7 @@
         <w:ind w:left="115" w:right="115"/>
       </w:pPr>
       <w:r>
+        <w:rPr/>
         <w:t xml:space="preserve">The query returned </w:t>
       </w:r>
       <w:r>
@@ -15322,10 +15358,11 @@
           <w:b/>
           <w:bCs/>
         </w:rPr>
-        <w:t>225 rows</w:t>
-      </w:r>
-      <w:r>
-        <w:t xml:space="preserve"> representing individual cardholders who executed purchases within the near-threshold window ($4,000.00 to $4,999.99) during calendar year 2014.</w:t>
+        <w:t xml:space="preserve">225 cardholders</w:t>
+      </w:r>
+      <w:r>
+        <w:rPr/>
+        <w:t xml:space="preserve"> with at least one purchase between $4,000.00 and $4,999.99.</w:t>
       </w:r>
     </w:p>
     <w:p>
@@ -15350,30 +15387,11 @@
           <w:b/>
           <w:bCs/>
         </w:rPr>
-        <w:t>Top Risk Employee:</w:t>
-      </w:r>
-      <w:r>
-        <w:t xml:space="preserve"> Employee B1FA2F0D executed </w:t>
-      </w:r>
-      <w:r>
-        <w:rPr>
-          <w:b/>
-          <w:bCs/>
-        </w:rPr>
-        <w:t>35 transactions</w:t>
-      </w:r>
-      <w:r>
-        <w:t xml:space="preserve"> in this range totaling </w:t>
-      </w:r>
-      <w:r>
-        <w:rPr>
-          <w:b/>
-          <w:bCs/>
-        </w:rPr>
-        <w:t>$158,311.52</w:t>
-      </w:r>
-      <w:r>
-        <w:t>.</w:t>
+        <w:t xml:space="preserve">Top Risk Employee:</w:t>
+      </w:r>
+      <w:r>
+        <w:rPr/>
+        <w:t xml:space="preserve"> Employee B1FA2F0D made 35 transactions in this range totalling $158,311.92.</w:t>
       </w:r>
     </w:p>
     <w:p>
@@ -15446,30 +15464,11 @@
           <w:b/>
           <w:bCs/>
         </w:rPr>
-        <w:t>Third Highest Risk:</w:t>
-      </w:r>
-      <w:r>
-        <w:t xml:space="preserve"> Employee D0993D5C executed </w:t>
-      </w:r>
-      <w:r>
-        <w:rPr>
-          <w:b/>
-          <w:bCs/>
-        </w:rPr>
-        <w:t>16 transactions</w:t>
-      </w:r>
-      <w:r>
-        <w:t xml:space="preserve"> totaling </w:t>
-      </w:r>
-      <w:r>
-        <w:rPr>
-          <w:b/>
-          <w:bCs/>
-        </w:rPr>
-        <w:t>$72,212.93</w:t>
-      </w:r>
-      <w:r>
-        <w:t>.</w:t>
+        <w:t xml:space="preserve">Third Highest Risk:</w:t>
+      </w:r>
+      <w:r>
+        <w:rPr/>
+        <w:t xml:space="preserve"> Employee D8983D5C made 16 transactions totalling $72,212.93.</w:t>
       </w:r>
     </w:p>
     <w:p>
@@ -15494,10 +15493,11 @@
           <w:b/>
           <w:bCs/>
         </w:rPr>
-        <w:t>Other Repeaters:</w:t>
-      </w:r>
-      <w:r>
-        <w:t xml:space="preserve"> Employee 14C66547 (9 transactions, $43,532.20), Employee 465E5000 (9 transactions, $39,102.76), Employee 073E5CEE (7 transactions, $32,232.23), and Employee 770E92ED (7 transactions, $30,566.39).</w:t>
+        <w:t xml:space="preserve">Other Repeaters:</w:t>
+      </w:r>
+      <w:r>
+        <w:rPr/>
+        <w:t xml:space="preserve"> Employee 14C66547 (9 transactions, $42,532.20), Employee 465E5080 (8, $38,102.76), Employee 073E5CEE (7, $32,232.23) and Employee 770E92ED (7, $30,566.39). B1FA2F0D and 51914657 are also the top two spenders in Control 1, so they should be investigated first.</w:t>
       </w:r>
     </w:p>
     <w:p>

</xml_diff>